<commit_message>
feat(templates): update Mandato (IM) document template
Update the Instrucción de Mandato template file with latest changes.

🤖 Generated with [Claude Code](https://claude.com/claude-code)

Co-Authored-By: Claude <noreply@anthropic.com>
</commit_message>
<xml_diff>
--- a/backend/templates/FK COL - Fin. COP - Mandato (IM).docx
+++ b/backend/templates/FK COL - Fin. COP - Mandato (IM).docx
@@ -1,10 +1,10 @@
 
 <file path=word/document.xml><?xml version="1.0" encoding="utf-8"?>
-<w:document xmlns:wpc="http://schemas.microsoft.com/office/word/2010/wordprocessingCanvas" xmlns:cx="http://schemas.microsoft.com/office/drawing/2014/chartex" xmlns:cx1="http://schemas.microsoft.com/office/drawing/2015/9/8/chartex" xmlns:cx2="http://schemas.microsoft.com/office/drawing/2015/10/21/chartex" xmlns:cx3="http://schemas.microsoft.com/office/drawing/2016/5/9/chartex" xmlns:cx4="http://schemas.microsoft.com/office/drawing/2016/5/10/chartex" xmlns:cx5="http://schemas.microsoft.com/office/drawing/2016/5/11/chartex" xmlns:cx6="http://schemas.microsoft.com/office/drawing/2016/5/12/chartex" xmlns:cx7="http://schemas.microsoft.com/office/drawing/2016/5/13/chartex" xmlns:cx8="http://schemas.microsoft.com/office/drawing/2016/5/14/chartex" xmlns:mc="http://schemas.openxmlformats.org/markup-compatibility/2006" xmlns:aink="http://schemas.microsoft.com/office/drawing/2016/ink" xmlns:am3d="http://schemas.microsoft.com/office/drawing/2017/model3d" xmlns:o="urn:schemas-microsoft-com:office:office" xmlns:oel="http://schemas.microsoft.com/office/2019/extlst" xmlns:r="http://schemas.openxmlformats.org/officeDocument/2006/relationships" xmlns:m="http://schemas.openxmlformats.org/officeDocument/2006/math" xmlns:v="urn:schemas-microsoft-com:vml" xmlns:wp14="http://schemas.microsoft.com/office/word/2010/wordprocessingDrawing" xmlns:wp="http://schemas.openxmlformats.org/drawingml/2006/wordprocessingDrawing" xmlns:w10="urn:schemas-microsoft-com:office:word" xmlns:w="http://schemas.openxmlformats.org/wordprocessingml/2006/main" xmlns:w14="http://schemas.microsoft.com/office/word/2010/wordml" xmlns:w15="http://schemas.microsoft.com/office/word/2012/wordml" xmlns:w16cex="http://schemas.microsoft.com/office/word/2018/wordml/cex" xmlns:w16cid="http://schemas.microsoft.com/office/word/2016/wordml/cid" xmlns:w16="http://schemas.microsoft.com/office/word/2018/wordml" xmlns:w16du="http://schemas.microsoft.com/office/word/2023/wordml/word16du" xmlns:w16sdtdh="http://schemas.microsoft.com/office/word/2020/wordml/sdtdatahash" xmlns:w16sdtfl="http://schemas.microsoft.com/office/word/2024/wordml/sdtformatlock" xmlns:w16se="http://schemas.microsoft.com/office/word/2015/wordml/symex" xmlns:wpg="http://schemas.microsoft.com/office/word/2010/wordprocessingGroup" xmlns:wpi="http://schemas.microsoft.com/office/word/2010/wordprocessingInk" xmlns:wne="http://schemas.microsoft.com/office/word/2006/wordml" xmlns:wps="http://schemas.microsoft.com/office/word/2010/wordprocessingShape" mc:Ignorable="w14 w15 w16se w16cid w16 w16cex w16sdtdh w16sdtfl w16du wp14">
+<w:document xmlns:wpc="http://schemas.microsoft.com/office/word/2010/wordprocessingCanvas" xmlns:cx="http://schemas.microsoft.com/office/drawing/2014/chartex" xmlns:cx1="http://schemas.microsoft.com/office/drawing/2015/9/8/chartex" xmlns:cx2="http://schemas.microsoft.com/office/drawing/2015/10/21/chartex" xmlns:cx3="http://schemas.microsoft.com/office/drawing/2016/5/9/chartex" xmlns:cx4="http://schemas.microsoft.com/office/drawing/2016/5/10/chartex" xmlns:cx5="http://schemas.microsoft.com/office/drawing/2016/5/11/chartex" xmlns:cx6="http://schemas.microsoft.com/office/drawing/2016/5/12/chartex" xmlns:cx7="http://schemas.microsoft.com/office/drawing/2016/5/13/chartex" xmlns:cx8="http://schemas.microsoft.com/office/drawing/2016/5/14/chartex" xmlns:mc="http://schemas.openxmlformats.org/markup-compatibility/2006" xmlns:aink="http://schemas.microsoft.com/office/drawing/2016/ink" xmlns:am3d="http://schemas.microsoft.com/office/drawing/2017/model3d" xmlns:o="urn:schemas-microsoft-com:office:office" xmlns:oel="http://schemas.microsoft.com/office/2019/extlst" xmlns:r="http://schemas.openxmlformats.org/officeDocument/2006/relationships" xmlns:m="http://schemas.openxmlformats.org/officeDocument/2006/math" xmlns:v="urn:schemas-microsoft-com:vml" xmlns:wp14="http://schemas.microsoft.com/office/word/2010/wordprocessingDrawing" xmlns:wp="http://schemas.openxmlformats.org/drawingml/2006/wordprocessingDrawing" xmlns:w10="urn:schemas-microsoft-com:office:word" xmlns:w="http://schemas.openxmlformats.org/wordprocessingml/2006/main" xmlns:w14="http://schemas.microsoft.com/office/word/2010/wordml" xmlns:w15="http://schemas.microsoft.com/office/word/2012/wordml" xmlns:w16cex="http://schemas.microsoft.com/office/word/2018/wordml/cex" xmlns:w16cid="http://schemas.microsoft.com/office/word/2016/wordml/cid" xmlns:w16="http://schemas.microsoft.com/office/word/2018/wordml" xmlns:w16sdtdh="http://schemas.microsoft.com/office/word/2020/wordml/sdtdatahash" xmlns:w16se="http://schemas.microsoft.com/office/word/2015/wordml/symex" xmlns:wpg="http://schemas.microsoft.com/office/word/2010/wordprocessingGroup" xmlns:wpi="http://schemas.microsoft.com/office/word/2010/wordprocessingInk" xmlns:wne="http://schemas.microsoft.com/office/word/2006/wordml" xmlns:wps="http://schemas.microsoft.com/office/word/2010/wordprocessingShape" mc:Ignorable="w14 w15 w16se w16cid w16 w16cex w16sdtdh wp14">
   <w:body>
     <w:p>
       <w:pPr>
-        <w:pStyle w:val="Heading1"/>
+        <w:pStyle w:val="Ttulo1"/>
         <w:numPr>
           <w:ilvl w:val="0"/>
           <w:numId w:val="0"/>
@@ -26,7 +26,7 @@
     </w:p>
     <w:tbl>
       <w:tblPr>
-        <w:tblStyle w:val="TableGrid"/>
+        <w:tblStyle w:val="Tablaconcuadrcula"/>
         <w:tblW w:w="0" w:type="auto"/>
         <w:tblCellMar>
           <w:top w:w="28" w:type="dxa"/>
@@ -117,7 +117,7 @@
             <w:commentRangeEnd w:id="0"/>
             <w:r>
               <w:rPr>
-                <w:rStyle w:val="CommentReference"/>
+                <w:rStyle w:val="Refdecomentario"/>
               </w:rPr>
               <w:commentReference w:id="0"/>
             </w:r>
@@ -197,7 +197,7 @@
             <w:commentRangeEnd w:id="1"/>
             <w:r>
               <w:rPr>
-                <w:rStyle w:val="CommentReference"/>
+                <w:rStyle w:val="Refdecomentario"/>
               </w:rPr>
               <w:commentReference w:id="1"/>
             </w:r>
@@ -330,7 +330,7 @@
             <w:commentRangeEnd w:id="2"/>
             <w:r>
               <w:rPr>
-                <w:rStyle w:val="CommentReference"/>
+                <w:rStyle w:val="Refdecomentario"/>
               </w:rPr>
               <w:commentReference w:id="2"/>
             </w:r>
@@ -556,7 +556,7 @@
             <w:commentRangeEnd w:id="3"/>
             <w:r>
               <w:rPr>
-                <w:rStyle w:val="CommentReference"/>
+                <w:rStyle w:val="Refdecomentario"/>
               </w:rPr>
               <w:commentReference w:id="3"/>
             </w:r>
@@ -644,6 +644,14 @@
             <w:r>
               <w:rPr>
                 <w:rFonts w:cs="Open Sans"/>
+                <w:sz w:val="18"/>
+                <w:szCs w:val="18"/>
+              </w:rPr>
+              <w:t>[</w:t>
+            </w:r>
+            <w:r>
+              <w:rPr>
+                <w:rFonts w:cs="Open Sans"/>
                 <w:bCs/>
                 <w:sz w:val="18"/>
                 <w:szCs w:val="18"/>
@@ -665,9 +673,18 @@
             <w:commentRangeEnd w:id="4"/>
             <w:r>
               <w:rPr>
-                <w:rStyle w:val="CommentReference"/>
+                <w:rStyle w:val="Refdecomentario"/>
               </w:rPr>
               <w:commentReference w:id="4"/>
+            </w:r>
+            <w:r>
+              <w:rPr>
+                <w:rFonts w:cs="Open Sans"/>
+                <w:bCs/>
+                <w:sz w:val="18"/>
+                <w:szCs w:val="18"/>
+              </w:rPr>
+              <w:t>]</w:t>
             </w:r>
             <w:r>
               <w:rPr>
@@ -743,7 +760,7 @@
           </w:p>
           <w:tbl>
             <w:tblPr>
-              <w:tblStyle w:val="TableGrid"/>
+              <w:tblStyle w:val="Tablaconcuadrcula"/>
               <w:tblW w:w="9587" w:type="dxa"/>
               <w:tblCellMar>
                 <w:top w:w="28" w:type="dxa"/>
@@ -1377,7 +1394,7 @@
           </w:tcPr>
           <w:p>
             <w:pPr>
-              <w:pStyle w:val="ListParagraph"/>
+              <w:pStyle w:val="Prrafodelista"/>
               <w:numPr>
                 <w:ilvl w:val="0"/>
                 <w:numId w:val="34"/>
@@ -1416,7 +1433,7 @@
           </w:p>
           <w:p>
             <w:pPr>
-              <w:pStyle w:val="ListParagraph"/>
+              <w:pStyle w:val="Prrafodelista"/>
               <w:numPr>
                 <w:ilvl w:val="0"/>
                 <w:numId w:val="34"/>
@@ -1455,7 +1472,7 @@
           </w:p>
           <w:p>
             <w:pPr>
-              <w:pStyle w:val="ListParagraph"/>
+              <w:pStyle w:val="Prrafodelista"/>
               <w:numPr>
                 <w:ilvl w:val="1"/>
                 <w:numId w:val="34"/>
@@ -1558,7 +1575,7 @@
           </w:p>
           <w:p>
             <w:pPr>
-              <w:pStyle w:val="ListParagraph"/>
+              <w:pStyle w:val="Prrafodelista"/>
               <w:numPr>
                 <w:ilvl w:val="1"/>
                 <w:numId w:val="34"/>
@@ -1675,7 +1692,27 @@
                 <w:szCs w:val="18"/>
                 <w:lang w:eastAsia="zh-CN" w:bidi="he-IL"/>
               </w:rPr>
-              <w:t xml:space="preserve"> del Mandante ni de las afiliadas del Mandante; y (ii) no es</w:t>
+              <w:t xml:space="preserve"> del Mandante ni de las afiliadas del Mandante; y (</w:t>
+            </w:r>
+            <w:proofErr w:type="spellStart"/>
+            <w:r>
+              <w:rPr>
+                <w:rFonts w:eastAsia="SimSun" w:cs="Open Sans"/>
+                <w:sz w:val="18"/>
+                <w:szCs w:val="18"/>
+                <w:lang w:eastAsia="zh-CN" w:bidi="he-IL"/>
+              </w:rPr>
+              <w:t>ii</w:t>
+            </w:r>
+            <w:proofErr w:type="spellEnd"/>
+            <w:r>
+              <w:rPr>
+                <w:rFonts w:eastAsia="SimSun" w:cs="Open Sans"/>
+                <w:sz w:val="18"/>
+                <w:szCs w:val="18"/>
+                <w:lang w:eastAsia="zh-CN" w:bidi="he-IL"/>
+              </w:rPr>
+              <w:t>) no es</w:t>
             </w:r>
             <w:r>
               <w:rPr>
@@ -1734,7 +1771,7 @@
           </w:p>
           <w:p>
             <w:pPr>
-              <w:pStyle w:val="ListParagraph"/>
+              <w:pStyle w:val="Prrafodelista"/>
               <w:numPr>
                 <w:ilvl w:val="0"/>
                 <w:numId w:val="34"/>
@@ -1789,7 +1826,7 @@
           </w:p>
           <w:p>
             <w:pPr>
-              <w:pStyle w:val="ListParagraph"/>
+              <w:pStyle w:val="Prrafodelista"/>
               <w:numPr>
                 <w:ilvl w:val="0"/>
                 <w:numId w:val="34"/>
@@ -2017,16 +2054,16 @@
 </file>
 
 <file path=word/comments.xml><?xml version="1.0" encoding="utf-8"?>
-<w:comments xmlns:wpc="http://schemas.microsoft.com/office/word/2010/wordprocessingCanvas" xmlns:cx="http://schemas.microsoft.com/office/drawing/2014/chartex" xmlns:cx1="http://schemas.microsoft.com/office/drawing/2015/9/8/chartex" xmlns:cx2="http://schemas.microsoft.com/office/drawing/2015/10/21/chartex" xmlns:cx3="http://schemas.microsoft.com/office/drawing/2016/5/9/chartex" xmlns:cx4="http://schemas.microsoft.com/office/drawing/2016/5/10/chartex" xmlns:cx5="http://schemas.microsoft.com/office/drawing/2016/5/11/chartex" xmlns:cx6="http://schemas.microsoft.com/office/drawing/2016/5/12/chartex" xmlns:cx7="http://schemas.microsoft.com/office/drawing/2016/5/13/chartex" xmlns:cx8="http://schemas.microsoft.com/office/drawing/2016/5/14/chartex" xmlns:mc="http://schemas.openxmlformats.org/markup-compatibility/2006" xmlns:aink="http://schemas.microsoft.com/office/drawing/2016/ink" xmlns:am3d="http://schemas.microsoft.com/office/drawing/2017/model3d" xmlns:o="urn:schemas-microsoft-com:office:office" xmlns:oel="http://schemas.microsoft.com/office/2019/extlst" xmlns:r="http://schemas.openxmlformats.org/officeDocument/2006/relationships" xmlns:m="http://schemas.openxmlformats.org/officeDocument/2006/math" xmlns:v="urn:schemas-microsoft-com:vml" xmlns:wp14="http://schemas.microsoft.com/office/word/2010/wordprocessingDrawing" xmlns:wp="http://schemas.openxmlformats.org/drawingml/2006/wordprocessingDrawing" xmlns:w10="urn:schemas-microsoft-com:office:word" xmlns:w="http://schemas.openxmlformats.org/wordprocessingml/2006/main" xmlns:w14="http://schemas.microsoft.com/office/word/2010/wordml" xmlns:w15="http://schemas.microsoft.com/office/word/2012/wordml" xmlns:w16cex="http://schemas.microsoft.com/office/word/2018/wordml/cex" xmlns:w16cid="http://schemas.microsoft.com/office/word/2016/wordml/cid" xmlns:w16="http://schemas.microsoft.com/office/word/2018/wordml" xmlns:w16du="http://schemas.microsoft.com/office/word/2023/wordml/word16du" xmlns:w16sdtdh="http://schemas.microsoft.com/office/word/2020/wordml/sdtdatahash" xmlns:w16sdtfl="http://schemas.microsoft.com/office/word/2024/wordml/sdtformatlock" xmlns:w16se="http://schemas.microsoft.com/office/word/2015/wordml/symex" xmlns:wpg="http://schemas.microsoft.com/office/word/2010/wordprocessingGroup" xmlns:wpi="http://schemas.microsoft.com/office/word/2010/wordprocessingInk" xmlns:wne="http://schemas.microsoft.com/office/word/2006/wordml" xmlns:wps="http://schemas.microsoft.com/office/word/2010/wordprocessingShape" mc:Ignorable="w14 w15 w16se w16cid w16 w16cex w16sdtdh w16sdtfl w16du wp14">
+<w:comments xmlns:wpc="http://schemas.microsoft.com/office/word/2010/wordprocessingCanvas" xmlns:cx="http://schemas.microsoft.com/office/drawing/2014/chartex" xmlns:cx1="http://schemas.microsoft.com/office/drawing/2015/9/8/chartex" xmlns:cx2="http://schemas.microsoft.com/office/drawing/2015/10/21/chartex" xmlns:cx3="http://schemas.microsoft.com/office/drawing/2016/5/9/chartex" xmlns:cx4="http://schemas.microsoft.com/office/drawing/2016/5/10/chartex" xmlns:cx5="http://schemas.microsoft.com/office/drawing/2016/5/11/chartex" xmlns:cx6="http://schemas.microsoft.com/office/drawing/2016/5/12/chartex" xmlns:cx7="http://schemas.microsoft.com/office/drawing/2016/5/13/chartex" xmlns:cx8="http://schemas.microsoft.com/office/drawing/2016/5/14/chartex" xmlns:mc="http://schemas.openxmlformats.org/markup-compatibility/2006" xmlns:aink="http://schemas.microsoft.com/office/drawing/2016/ink" xmlns:am3d="http://schemas.microsoft.com/office/drawing/2017/model3d" xmlns:o="urn:schemas-microsoft-com:office:office" xmlns:oel="http://schemas.microsoft.com/office/2019/extlst" xmlns:r="http://schemas.openxmlformats.org/officeDocument/2006/relationships" xmlns:m="http://schemas.openxmlformats.org/officeDocument/2006/math" xmlns:v="urn:schemas-microsoft-com:vml" xmlns:wp14="http://schemas.microsoft.com/office/word/2010/wordprocessingDrawing" xmlns:wp="http://schemas.openxmlformats.org/drawingml/2006/wordprocessingDrawing" xmlns:w10="urn:schemas-microsoft-com:office:word" xmlns:w="http://schemas.openxmlformats.org/wordprocessingml/2006/main" xmlns:w14="http://schemas.microsoft.com/office/word/2010/wordml" xmlns:w15="http://schemas.microsoft.com/office/word/2012/wordml" xmlns:w16cex="http://schemas.microsoft.com/office/word/2018/wordml/cex" xmlns:w16cid="http://schemas.microsoft.com/office/word/2016/wordml/cid" xmlns:w16="http://schemas.microsoft.com/office/word/2018/wordml" xmlns:w16sdtdh="http://schemas.microsoft.com/office/word/2020/wordml/sdtdatahash" xmlns:w16se="http://schemas.microsoft.com/office/word/2015/wordml/symex" xmlns:wpg="http://schemas.microsoft.com/office/word/2010/wordprocessingGroup" xmlns:wpi="http://schemas.microsoft.com/office/word/2010/wordprocessingInk" xmlns:wne="http://schemas.microsoft.com/office/word/2006/wordml" xmlns:wps="http://schemas.microsoft.com/office/word/2010/wordprocessingShape" mc:Ignorable="w14 w15 w16se w16cid w16 w16cex w16sdtdh wp14">
   <w:comment w:id="0" w:author="Sofia Tobon -FK" w:date="2025-12-01T07:54:00Z" w:initials="ST">
     <w:p>
       <w:pPr>
-        <w:pStyle w:val="CommentText"/>
+        <w:pStyle w:val="Textocomentario"/>
         <w:jc w:val="left"/>
       </w:pPr>
       <w:r>
         <w:rPr>
-          <w:rStyle w:val="CommentReference"/>
+          <w:rStyle w:val="Refdecomentario"/>
         </w:rPr>
         <w:annotationRef/>
       </w:r>
@@ -2038,12 +2075,12 @@
   <w:comment w:id="1" w:author="Sofia Tobon -FK" w:date="2025-12-01T07:54:00Z" w:initials="ST">
     <w:p>
       <w:pPr>
-        <w:pStyle w:val="CommentText"/>
+        <w:pStyle w:val="Textocomentario"/>
         <w:jc w:val="left"/>
       </w:pPr>
       <w:r>
         <w:rPr>
-          <w:rStyle w:val="CommentReference"/>
+          <w:rStyle w:val="Refdecomentario"/>
         </w:rPr>
         <w:annotationRef/>
       </w:r>
@@ -2055,12 +2092,12 @@
   <w:comment w:id="2" w:author="Sofia Tobon -FK" w:date="2025-12-01T07:53:00Z" w:initials="ST">
     <w:p>
       <w:pPr>
-        <w:pStyle w:val="CommentText"/>
+        <w:pStyle w:val="Textocomentario"/>
         <w:jc w:val="left"/>
       </w:pPr>
       <w:r>
         <w:rPr>
-          <w:rStyle w:val="CommentReference"/>
+          <w:rStyle w:val="Refdecomentario"/>
         </w:rPr>
         <w:annotationRef/>
       </w:r>
@@ -2072,12 +2109,12 @@
   <w:comment w:id="3" w:author="Sofia Tobon -FK" w:date="2025-12-01T07:55:00Z" w:initials="ST">
     <w:p>
       <w:pPr>
-        <w:pStyle w:val="CommentText"/>
+        <w:pStyle w:val="Textocomentario"/>
         <w:jc w:val="left"/>
       </w:pPr>
       <w:r>
         <w:rPr>
-          <w:rStyle w:val="CommentReference"/>
+          <w:rStyle w:val="Refdecomentario"/>
         </w:rPr>
         <w:annotationRef/>
       </w:r>
@@ -2089,12 +2126,12 @@
   <w:comment w:id="4" w:author="Sofia Tobon -FK" w:date="2025-12-01T07:54:00Z" w:initials="ST">
     <w:p>
       <w:pPr>
-        <w:pStyle w:val="CommentText"/>
+        <w:pStyle w:val="Textocomentario"/>
         <w:jc w:val="left"/>
       </w:pPr>
       <w:r>
         <w:rPr>
-          <w:rStyle w:val="CommentReference"/>
+          <w:rStyle w:val="Refdecomentario"/>
         </w:rPr>
         <w:annotationRef/>
       </w:r>
@@ -2107,7 +2144,7 @@
 </file>
 
 <file path=word/commentsExtended.xml><?xml version="1.0" encoding="utf-8"?>
-<w15:commentsEx xmlns:wpc="http://schemas.microsoft.com/office/word/2010/wordprocessingCanvas" xmlns:cx="http://schemas.microsoft.com/office/drawing/2014/chartex" xmlns:cx1="http://schemas.microsoft.com/office/drawing/2015/9/8/chartex" xmlns:cx2="http://schemas.microsoft.com/office/drawing/2015/10/21/chartex" xmlns:cx3="http://schemas.microsoft.com/office/drawing/2016/5/9/chartex" xmlns:cx4="http://schemas.microsoft.com/office/drawing/2016/5/10/chartex" xmlns:cx5="http://schemas.microsoft.com/office/drawing/2016/5/11/chartex" xmlns:cx6="http://schemas.microsoft.com/office/drawing/2016/5/12/chartex" xmlns:cx7="http://schemas.microsoft.com/office/drawing/2016/5/13/chartex" xmlns:cx8="http://schemas.microsoft.com/office/drawing/2016/5/14/chartex" xmlns:mc="http://schemas.openxmlformats.org/markup-compatibility/2006" xmlns:aink="http://schemas.microsoft.com/office/drawing/2016/ink" xmlns:am3d="http://schemas.microsoft.com/office/drawing/2017/model3d" xmlns:o="urn:schemas-microsoft-com:office:office" xmlns:oel="http://schemas.microsoft.com/office/2019/extlst" xmlns:r="http://schemas.openxmlformats.org/officeDocument/2006/relationships" xmlns:m="http://schemas.openxmlformats.org/officeDocument/2006/math" xmlns:v="urn:schemas-microsoft-com:vml" xmlns:wp14="http://schemas.microsoft.com/office/word/2010/wordprocessingDrawing" xmlns:wp="http://schemas.openxmlformats.org/drawingml/2006/wordprocessingDrawing" xmlns:w10="urn:schemas-microsoft-com:office:word" xmlns:w="http://schemas.openxmlformats.org/wordprocessingml/2006/main" xmlns:w14="http://schemas.microsoft.com/office/word/2010/wordml" xmlns:w15="http://schemas.microsoft.com/office/word/2012/wordml" xmlns:w16cex="http://schemas.microsoft.com/office/word/2018/wordml/cex" xmlns:w16cid="http://schemas.microsoft.com/office/word/2016/wordml/cid" xmlns:w16="http://schemas.microsoft.com/office/word/2018/wordml" xmlns:w16du="http://schemas.microsoft.com/office/word/2023/wordml/word16du" xmlns:w16sdtdh="http://schemas.microsoft.com/office/word/2020/wordml/sdtdatahash" xmlns:w16sdtfl="http://schemas.microsoft.com/office/word/2024/wordml/sdtformatlock" xmlns:w16se="http://schemas.microsoft.com/office/word/2015/wordml/symex" xmlns:wpg="http://schemas.microsoft.com/office/word/2010/wordprocessingGroup" xmlns:wpi="http://schemas.microsoft.com/office/word/2010/wordprocessingInk" xmlns:wne="http://schemas.microsoft.com/office/word/2006/wordml" xmlns:wps="http://schemas.microsoft.com/office/word/2010/wordprocessingShape" mc:Ignorable="w14 w15 w16se w16cid w16 w16cex w16sdtdh w16sdtfl w16du wp14">
+<w15:commentsEx xmlns:wpc="http://schemas.microsoft.com/office/word/2010/wordprocessingCanvas" xmlns:cx="http://schemas.microsoft.com/office/drawing/2014/chartex" xmlns:cx1="http://schemas.microsoft.com/office/drawing/2015/9/8/chartex" xmlns:cx2="http://schemas.microsoft.com/office/drawing/2015/10/21/chartex" xmlns:cx3="http://schemas.microsoft.com/office/drawing/2016/5/9/chartex" xmlns:cx4="http://schemas.microsoft.com/office/drawing/2016/5/10/chartex" xmlns:cx5="http://schemas.microsoft.com/office/drawing/2016/5/11/chartex" xmlns:cx6="http://schemas.microsoft.com/office/drawing/2016/5/12/chartex" xmlns:cx7="http://schemas.microsoft.com/office/drawing/2016/5/13/chartex" xmlns:cx8="http://schemas.microsoft.com/office/drawing/2016/5/14/chartex" xmlns:mc="http://schemas.openxmlformats.org/markup-compatibility/2006" xmlns:aink="http://schemas.microsoft.com/office/drawing/2016/ink" xmlns:am3d="http://schemas.microsoft.com/office/drawing/2017/model3d" xmlns:o="urn:schemas-microsoft-com:office:office" xmlns:oel="http://schemas.microsoft.com/office/2019/extlst" xmlns:r="http://schemas.openxmlformats.org/officeDocument/2006/relationships" xmlns:m="http://schemas.openxmlformats.org/officeDocument/2006/math" xmlns:v="urn:schemas-microsoft-com:vml" xmlns:wp14="http://schemas.microsoft.com/office/word/2010/wordprocessingDrawing" xmlns:wp="http://schemas.openxmlformats.org/drawingml/2006/wordprocessingDrawing" xmlns:w10="urn:schemas-microsoft-com:office:word" xmlns:w="http://schemas.openxmlformats.org/wordprocessingml/2006/main" xmlns:w14="http://schemas.microsoft.com/office/word/2010/wordml" xmlns:w15="http://schemas.microsoft.com/office/word/2012/wordml" xmlns:w16cex="http://schemas.microsoft.com/office/word/2018/wordml/cex" xmlns:w16cid="http://schemas.microsoft.com/office/word/2016/wordml/cid" xmlns:w16="http://schemas.microsoft.com/office/word/2018/wordml" xmlns:w16sdtdh="http://schemas.microsoft.com/office/word/2020/wordml/sdtdatahash" xmlns:w16se="http://schemas.microsoft.com/office/word/2015/wordml/symex" xmlns:wpg="http://schemas.microsoft.com/office/word/2010/wordprocessingGroup" xmlns:wpi="http://schemas.microsoft.com/office/word/2010/wordprocessingInk" xmlns:wne="http://schemas.microsoft.com/office/word/2006/wordml" xmlns:wps="http://schemas.microsoft.com/office/word/2010/wordprocessingShape" mc:Ignorable="w14 w15 w16se w16cid w16 w16cex w16sdtdh wp14">
   <w15:commentEx w15:paraId="02F0120B" w15:done="0"/>
   <w15:commentEx w15:paraId="6CB8879E" w15:done="0"/>
   <w15:commentEx w15:paraId="725C5427" w15:done="0"/>
@@ -2117,7 +2154,7 @@
 </file>
 
 <file path=word/commentsExtensible.xml><?xml version="1.0" encoding="utf-8"?>
-<w16cex:commentsExtensible xmlns:wpc="http://schemas.microsoft.com/office/word/2010/wordprocessingCanvas" xmlns:cx="http://schemas.microsoft.com/office/drawing/2014/chartex" xmlns:cx1="http://schemas.microsoft.com/office/drawing/2015/9/8/chartex" xmlns:cx2="http://schemas.microsoft.com/office/drawing/2015/10/21/chartex" xmlns:cx3="http://schemas.microsoft.com/office/drawing/2016/5/9/chartex" xmlns:cx4="http://schemas.microsoft.com/office/drawing/2016/5/10/chartex" xmlns:cx5="http://schemas.microsoft.com/office/drawing/2016/5/11/chartex" xmlns:cx6="http://schemas.microsoft.com/office/drawing/2016/5/12/chartex" xmlns:cx7="http://schemas.microsoft.com/office/drawing/2016/5/13/chartex" xmlns:cx8="http://schemas.microsoft.com/office/drawing/2016/5/14/chartex" xmlns:cr="http://schemas.microsoft.com/office/comments/2020/reactions" xmlns:mc="http://schemas.openxmlformats.org/markup-compatibility/2006" xmlns:aink="http://schemas.microsoft.com/office/drawing/2016/ink" xmlns:am3d="http://schemas.microsoft.com/office/drawing/2017/model3d" xmlns:o="urn:schemas-microsoft-com:office:office" xmlns:oel="http://schemas.microsoft.com/office/2019/extlst" xmlns:r="http://schemas.openxmlformats.org/officeDocument/2006/relationships" xmlns:m="http://schemas.openxmlformats.org/officeDocument/2006/math" xmlns:v="urn:schemas-microsoft-com:vml" xmlns:wp14="http://schemas.microsoft.com/office/word/2010/wordprocessingDrawing" xmlns:wp="http://schemas.openxmlformats.org/drawingml/2006/wordprocessingDrawing" xmlns:w10="urn:schemas-microsoft-com:office:word" xmlns:w="http://schemas.openxmlformats.org/wordprocessingml/2006/main" xmlns:w14="http://schemas.microsoft.com/office/word/2010/wordml" xmlns:w15="http://schemas.microsoft.com/office/word/2012/wordml" xmlns:w16cex="http://schemas.microsoft.com/office/word/2018/wordml/cex" xmlns:w16cid="http://schemas.microsoft.com/office/word/2016/wordml/cid" xmlns:w16="http://schemas.microsoft.com/office/word/2018/wordml" xmlns:w16du="http://schemas.microsoft.com/office/word/2023/wordml/word16du" xmlns:w16sdtdh="http://schemas.microsoft.com/office/word/2020/wordml/sdtdatahash" xmlns:w16sdtfl="http://schemas.microsoft.com/office/word/2024/wordml/sdtformatlock" xmlns:w16se="http://schemas.microsoft.com/office/word/2015/wordml/symex" xmlns:wpg="http://schemas.microsoft.com/office/word/2010/wordprocessingGroup" xmlns:wpi="http://schemas.microsoft.com/office/word/2010/wordprocessingInk" xmlns:wne="http://schemas.microsoft.com/office/word/2006/wordml" xmlns:wps="http://schemas.microsoft.com/office/word/2010/wordprocessingShape" mc:Ignorable="w14 w15 w16se w16cid w16 w16cex w16sdtdh w16sdtfl cr w16du wp14">
+<w16cex:commentsExtensible xmlns:wpc="http://schemas.microsoft.com/office/word/2010/wordprocessingCanvas" xmlns:cx="http://schemas.microsoft.com/office/drawing/2014/chartex" xmlns:cx1="http://schemas.microsoft.com/office/drawing/2015/9/8/chartex" xmlns:cx2="http://schemas.microsoft.com/office/drawing/2015/10/21/chartex" xmlns:cx3="http://schemas.microsoft.com/office/drawing/2016/5/9/chartex" xmlns:cx4="http://schemas.microsoft.com/office/drawing/2016/5/10/chartex" xmlns:cx5="http://schemas.microsoft.com/office/drawing/2016/5/11/chartex" xmlns:cx6="http://schemas.microsoft.com/office/drawing/2016/5/12/chartex" xmlns:cx7="http://schemas.microsoft.com/office/drawing/2016/5/13/chartex" xmlns:cx8="http://schemas.microsoft.com/office/drawing/2016/5/14/chartex" xmlns:mc="http://schemas.openxmlformats.org/markup-compatibility/2006" xmlns:aink="http://schemas.microsoft.com/office/drawing/2016/ink" xmlns:am3d="http://schemas.microsoft.com/office/drawing/2017/model3d" xmlns:o="urn:schemas-microsoft-com:office:office" xmlns:oel="http://schemas.microsoft.com/office/2019/extlst" xmlns:r="http://schemas.openxmlformats.org/officeDocument/2006/relationships" xmlns:m="http://schemas.openxmlformats.org/officeDocument/2006/math" xmlns:v="urn:schemas-microsoft-com:vml" xmlns:wp14="http://schemas.microsoft.com/office/word/2010/wordprocessingDrawing" xmlns:wp="http://schemas.openxmlformats.org/drawingml/2006/wordprocessingDrawing" xmlns:w10="urn:schemas-microsoft-com:office:word" xmlns:w="http://schemas.openxmlformats.org/wordprocessingml/2006/main" xmlns:w14="http://schemas.microsoft.com/office/word/2010/wordml" xmlns:w15="http://schemas.microsoft.com/office/word/2012/wordml" xmlns:w16cex="http://schemas.microsoft.com/office/word/2018/wordml/cex" xmlns:w16cid="http://schemas.microsoft.com/office/word/2016/wordml/cid" xmlns:w16="http://schemas.microsoft.com/office/word/2018/wordml" xmlns:w16sdtdh="http://schemas.microsoft.com/office/word/2020/wordml/sdtdatahash" xmlns:w16se="http://schemas.microsoft.com/office/word/2015/wordml/symex" xmlns:wpg="http://schemas.microsoft.com/office/word/2010/wordprocessingGroup" xmlns:wpi="http://schemas.microsoft.com/office/word/2010/wordprocessingInk" xmlns:wne="http://schemas.microsoft.com/office/word/2006/wordml" xmlns:wps="http://schemas.microsoft.com/office/word/2010/wordprocessingShape" mc:Ignorable="w14 w15 w16se w16cid w16 w16cex w16sdtdh wp14">
   <w16cex:commentExtensible w16cex:durableId="50F6C254" w16cex:dateUtc="2025-12-01T12:54:00Z"/>
   <w16cex:commentExtensible w16cex:durableId="39B16711" w16cex:dateUtc="2025-12-01T12:54:00Z"/>
   <w16cex:commentExtensible w16cex:durableId="728EF2C2" w16cex:dateUtc="2025-12-01T12:53:00Z"/>
@@ -2127,7 +2164,7 @@
 </file>
 
 <file path=word/commentsIds.xml><?xml version="1.0" encoding="utf-8"?>
-<w16cid:commentsIds xmlns:wpc="http://schemas.microsoft.com/office/word/2010/wordprocessingCanvas" xmlns:cx="http://schemas.microsoft.com/office/drawing/2014/chartex" xmlns:cx1="http://schemas.microsoft.com/office/drawing/2015/9/8/chartex" xmlns:cx2="http://schemas.microsoft.com/office/drawing/2015/10/21/chartex" xmlns:cx3="http://schemas.microsoft.com/office/drawing/2016/5/9/chartex" xmlns:cx4="http://schemas.microsoft.com/office/drawing/2016/5/10/chartex" xmlns:cx5="http://schemas.microsoft.com/office/drawing/2016/5/11/chartex" xmlns:cx6="http://schemas.microsoft.com/office/drawing/2016/5/12/chartex" xmlns:cx7="http://schemas.microsoft.com/office/drawing/2016/5/13/chartex" xmlns:cx8="http://schemas.microsoft.com/office/drawing/2016/5/14/chartex" xmlns:mc="http://schemas.openxmlformats.org/markup-compatibility/2006" xmlns:aink="http://schemas.microsoft.com/office/drawing/2016/ink" xmlns:am3d="http://schemas.microsoft.com/office/drawing/2017/model3d" xmlns:o="urn:schemas-microsoft-com:office:office" xmlns:oel="http://schemas.microsoft.com/office/2019/extlst" xmlns:r="http://schemas.openxmlformats.org/officeDocument/2006/relationships" xmlns:m="http://schemas.openxmlformats.org/officeDocument/2006/math" xmlns:v="urn:schemas-microsoft-com:vml" xmlns:wp14="http://schemas.microsoft.com/office/word/2010/wordprocessingDrawing" xmlns:wp="http://schemas.openxmlformats.org/drawingml/2006/wordprocessingDrawing" xmlns:w10="urn:schemas-microsoft-com:office:word" xmlns:w="http://schemas.openxmlformats.org/wordprocessingml/2006/main" xmlns:w14="http://schemas.microsoft.com/office/word/2010/wordml" xmlns:w15="http://schemas.microsoft.com/office/word/2012/wordml" xmlns:w16cex="http://schemas.microsoft.com/office/word/2018/wordml/cex" xmlns:w16cid="http://schemas.microsoft.com/office/word/2016/wordml/cid" xmlns:w16="http://schemas.microsoft.com/office/word/2018/wordml" xmlns:w16du="http://schemas.microsoft.com/office/word/2023/wordml/word16du" xmlns:w16sdtdh="http://schemas.microsoft.com/office/word/2020/wordml/sdtdatahash" xmlns:w16sdtfl="http://schemas.microsoft.com/office/word/2024/wordml/sdtformatlock" xmlns:w16se="http://schemas.microsoft.com/office/word/2015/wordml/symex" xmlns:wpg="http://schemas.microsoft.com/office/word/2010/wordprocessingGroup" xmlns:wpi="http://schemas.microsoft.com/office/word/2010/wordprocessingInk" xmlns:wne="http://schemas.microsoft.com/office/word/2006/wordml" xmlns:wps="http://schemas.microsoft.com/office/word/2010/wordprocessingShape" mc:Ignorable="w14 w15 w16se w16cid w16 w16cex w16sdtdh w16sdtfl w16du wp14">
+<w16cid:commentsIds xmlns:wpc="http://schemas.microsoft.com/office/word/2010/wordprocessingCanvas" xmlns:cx="http://schemas.microsoft.com/office/drawing/2014/chartex" xmlns:cx1="http://schemas.microsoft.com/office/drawing/2015/9/8/chartex" xmlns:cx2="http://schemas.microsoft.com/office/drawing/2015/10/21/chartex" xmlns:cx3="http://schemas.microsoft.com/office/drawing/2016/5/9/chartex" xmlns:cx4="http://schemas.microsoft.com/office/drawing/2016/5/10/chartex" xmlns:cx5="http://schemas.microsoft.com/office/drawing/2016/5/11/chartex" xmlns:cx6="http://schemas.microsoft.com/office/drawing/2016/5/12/chartex" xmlns:cx7="http://schemas.microsoft.com/office/drawing/2016/5/13/chartex" xmlns:cx8="http://schemas.microsoft.com/office/drawing/2016/5/14/chartex" xmlns:mc="http://schemas.openxmlformats.org/markup-compatibility/2006" xmlns:aink="http://schemas.microsoft.com/office/drawing/2016/ink" xmlns:am3d="http://schemas.microsoft.com/office/drawing/2017/model3d" xmlns:o="urn:schemas-microsoft-com:office:office" xmlns:oel="http://schemas.microsoft.com/office/2019/extlst" xmlns:r="http://schemas.openxmlformats.org/officeDocument/2006/relationships" xmlns:m="http://schemas.openxmlformats.org/officeDocument/2006/math" xmlns:v="urn:schemas-microsoft-com:vml" xmlns:wp14="http://schemas.microsoft.com/office/word/2010/wordprocessingDrawing" xmlns:wp="http://schemas.openxmlformats.org/drawingml/2006/wordprocessingDrawing" xmlns:w10="urn:schemas-microsoft-com:office:word" xmlns:w="http://schemas.openxmlformats.org/wordprocessingml/2006/main" xmlns:w14="http://schemas.microsoft.com/office/word/2010/wordml" xmlns:w15="http://schemas.microsoft.com/office/word/2012/wordml" xmlns:w16cex="http://schemas.microsoft.com/office/word/2018/wordml/cex" xmlns:w16cid="http://schemas.microsoft.com/office/word/2016/wordml/cid" xmlns:w16="http://schemas.microsoft.com/office/word/2018/wordml" xmlns:w16sdtdh="http://schemas.microsoft.com/office/word/2020/wordml/sdtdatahash" xmlns:w16se="http://schemas.microsoft.com/office/word/2015/wordml/symex" xmlns:wpg="http://schemas.microsoft.com/office/word/2010/wordprocessingGroup" xmlns:wpi="http://schemas.microsoft.com/office/word/2010/wordprocessingInk" xmlns:wne="http://schemas.microsoft.com/office/word/2006/wordml" xmlns:wps="http://schemas.microsoft.com/office/word/2010/wordprocessingShape" mc:Ignorable="w14 w15 w16se w16cid w16 w16cex w16sdtdh wp14">
   <w16cid:commentId w16cid:paraId="02F0120B" w16cid:durableId="50F6C254"/>
   <w16cid:commentId w16cid:paraId="6CB8879E" w16cid:durableId="39B16711"/>
   <w16cid:commentId w16cid:paraId="725C5427" w16cid:durableId="728EF2C2"/>
@@ -2137,7 +2174,7 @@
 </file>
 
 <file path=word/endnotes.xml><?xml version="1.0" encoding="utf-8"?>
-<w:endnotes xmlns:wpc="http://schemas.microsoft.com/office/word/2010/wordprocessingCanvas" xmlns:cx="http://schemas.microsoft.com/office/drawing/2014/chartex" xmlns:cx1="http://schemas.microsoft.com/office/drawing/2015/9/8/chartex" xmlns:cx2="http://schemas.microsoft.com/office/drawing/2015/10/21/chartex" xmlns:cx3="http://schemas.microsoft.com/office/drawing/2016/5/9/chartex" xmlns:cx4="http://schemas.microsoft.com/office/drawing/2016/5/10/chartex" xmlns:cx5="http://schemas.microsoft.com/office/drawing/2016/5/11/chartex" xmlns:cx6="http://schemas.microsoft.com/office/drawing/2016/5/12/chartex" xmlns:cx7="http://schemas.microsoft.com/office/drawing/2016/5/13/chartex" xmlns:cx8="http://schemas.microsoft.com/office/drawing/2016/5/14/chartex" xmlns:mc="http://schemas.openxmlformats.org/markup-compatibility/2006" xmlns:aink="http://schemas.microsoft.com/office/drawing/2016/ink" xmlns:am3d="http://schemas.microsoft.com/office/drawing/2017/model3d" xmlns:o="urn:schemas-microsoft-com:office:office" xmlns:oel="http://schemas.microsoft.com/office/2019/extlst" xmlns:r="http://schemas.openxmlformats.org/officeDocument/2006/relationships" xmlns:m="http://schemas.openxmlformats.org/officeDocument/2006/math" xmlns:v="urn:schemas-microsoft-com:vml" xmlns:wp14="http://schemas.microsoft.com/office/word/2010/wordprocessingDrawing" xmlns:wp="http://schemas.openxmlformats.org/drawingml/2006/wordprocessingDrawing" xmlns:w10="urn:schemas-microsoft-com:office:word" xmlns:w="http://schemas.openxmlformats.org/wordprocessingml/2006/main" xmlns:w14="http://schemas.microsoft.com/office/word/2010/wordml" xmlns:w15="http://schemas.microsoft.com/office/word/2012/wordml" xmlns:w16cex="http://schemas.microsoft.com/office/word/2018/wordml/cex" xmlns:w16cid="http://schemas.microsoft.com/office/word/2016/wordml/cid" xmlns:w16="http://schemas.microsoft.com/office/word/2018/wordml" xmlns:w16du="http://schemas.microsoft.com/office/word/2023/wordml/word16du" xmlns:w16sdtdh="http://schemas.microsoft.com/office/word/2020/wordml/sdtdatahash" xmlns:w16sdtfl="http://schemas.microsoft.com/office/word/2024/wordml/sdtformatlock" xmlns:w16se="http://schemas.microsoft.com/office/word/2015/wordml/symex" xmlns:wpg="http://schemas.microsoft.com/office/word/2010/wordprocessingGroup" xmlns:wpi="http://schemas.microsoft.com/office/word/2010/wordprocessingInk" xmlns:wne="http://schemas.microsoft.com/office/word/2006/wordml" xmlns:wps="http://schemas.microsoft.com/office/word/2010/wordprocessingShape" mc:Ignorable="w14 w15 w16se w16cid w16 w16cex w16sdtdh w16sdtfl w16du wp14">
+<w:endnotes xmlns:wpc="http://schemas.microsoft.com/office/word/2010/wordprocessingCanvas" xmlns:cx="http://schemas.microsoft.com/office/drawing/2014/chartex" xmlns:cx1="http://schemas.microsoft.com/office/drawing/2015/9/8/chartex" xmlns:cx2="http://schemas.microsoft.com/office/drawing/2015/10/21/chartex" xmlns:cx3="http://schemas.microsoft.com/office/drawing/2016/5/9/chartex" xmlns:cx4="http://schemas.microsoft.com/office/drawing/2016/5/10/chartex" xmlns:cx5="http://schemas.microsoft.com/office/drawing/2016/5/11/chartex" xmlns:cx6="http://schemas.microsoft.com/office/drawing/2016/5/12/chartex" xmlns:cx7="http://schemas.microsoft.com/office/drawing/2016/5/13/chartex" xmlns:cx8="http://schemas.microsoft.com/office/drawing/2016/5/14/chartex" xmlns:mc="http://schemas.openxmlformats.org/markup-compatibility/2006" xmlns:aink="http://schemas.microsoft.com/office/drawing/2016/ink" xmlns:am3d="http://schemas.microsoft.com/office/drawing/2017/model3d" xmlns:o="urn:schemas-microsoft-com:office:office" xmlns:oel="http://schemas.microsoft.com/office/2019/extlst" xmlns:r="http://schemas.openxmlformats.org/officeDocument/2006/relationships" xmlns:m="http://schemas.openxmlformats.org/officeDocument/2006/math" xmlns:v="urn:schemas-microsoft-com:vml" xmlns:wp14="http://schemas.microsoft.com/office/word/2010/wordprocessingDrawing" xmlns:wp="http://schemas.openxmlformats.org/drawingml/2006/wordprocessingDrawing" xmlns:w10="urn:schemas-microsoft-com:office:word" xmlns:w="http://schemas.openxmlformats.org/wordprocessingml/2006/main" xmlns:w14="http://schemas.microsoft.com/office/word/2010/wordml" xmlns:w15="http://schemas.microsoft.com/office/word/2012/wordml" xmlns:w16cex="http://schemas.microsoft.com/office/word/2018/wordml/cex" xmlns:w16cid="http://schemas.microsoft.com/office/word/2016/wordml/cid" xmlns:w16="http://schemas.microsoft.com/office/word/2018/wordml" xmlns:w16sdtdh="http://schemas.microsoft.com/office/word/2020/wordml/sdtdatahash" xmlns:w16se="http://schemas.microsoft.com/office/word/2015/wordml/symex" xmlns:wpg="http://schemas.microsoft.com/office/word/2010/wordprocessingGroup" xmlns:wpi="http://schemas.microsoft.com/office/word/2010/wordprocessingInk" xmlns:wne="http://schemas.microsoft.com/office/word/2006/wordml" xmlns:wps="http://schemas.microsoft.com/office/word/2010/wordprocessingShape" mc:Ignorable="w14 w15 w16se w16cid w16 w16cex w16sdtdh wp14">
   <w:endnote w:type="separator" w:id="-1">
     <w:p>
       <w:pPr>
@@ -2162,10 +2199,10 @@
 </file>
 
 <file path=word/footer1.xml><?xml version="1.0" encoding="utf-8"?>
-<w:ftr xmlns:wpc="http://schemas.microsoft.com/office/word/2010/wordprocessingCanvas" xmlns:cx="http://schemas.microsoft.com/office/drawing/2014/chartex" xmlns:cx1="http://schemas.microsoft.com/office/drawing/2015/9/8/chartex" xmlns:cx2="http://schemas.microsoft.com/office/drawing/2015/10/21/chartex" xmlns:cx3="http://schemas.microsoft.com/office/drawing/2016/5/9/chartex" xmlns:cx4="http://schemas.microsoft.com/office/drawing/2016/5/10/chartex" xmlns:cx5="http://schemas.microsoft.com/office/drawing/2016/5/11/chartex" xmlns:cx6="http://schemas.microsoft.com/office/drawing/2016/5/12/chartex" xmlns:cx7="http://schemas.microsoft.com/office/drawing/2016/5/13/chartex" xmlns:cx8="http://schemas.microsoft.com/office/drawing/2016/5/14/chartex" xmlns:mc="http://schemas.openxmlformats.org/markup-compatibility/2006" xmlns:aink="http://schemas.microsoft.com/office/drawing/2016/ink" xmlns:am3d="http://schemas.microsoft.com/office/drawing/2017/model3d" xmlns:o="urn:schemas-microsoft-com:office:office" xmlns:oel="http://schemas.microsoft.com/office/2019/extlst" xmlns:r="http://schemas.openxmlformats.org/officeDocument/2006/relationships" xmlns:m="http://schemas.openxmlformats.org/officeDocument/2006/math" xmlns:v="urn:schemas-microsoft-com:vml" xmlns:wp14="http://schemas.microsoft.com/office/word/2010/wordprocessingDrawing" xmlns:wp="http://schemas.openxmlformats.org/drawingml/2006/wordprocessingDrawing" xmlns:w10="urn:schemas-microsoft-com:office:word" xmlns:w="http://schemas.openxmlformats.org/wordprocessingml/2006/main" xmlns:w14="http://schemas.microsoft.com/office/word/2010/wordml" xmlns:w15="http://schemas.microsoft.com/office/word/2012/wordml" xmlns:w16cex="http://schemas.microsoft.com/office/word/2018/wordml/cex" xmlns:w16cid="http://schemas.microsoft.com/office/word/2016/wordml/cid" xmlns:w16="http://schemas.microsoft.com/office/word/2018/wordml" xmlns:w16du="http://schemas.microsoft.com/office/word/2023/wordml/word16du" xmlns:w16sdtdh="http://schemas.microsoft.com/office/word/2020/wordml/sdtdatahash" xmlns:w16sdtfl="http://schemas.microsoft.com/office/word/2024/wordml/sdtformatlock" xmlns:w16se="http://schemas.microsoft.com/office/word/2015/wordml/symex" xmlns:wpg="http://schemas.microsoft.com/office/word/2010/wordprocessingGroup" xmlns:wpi="http://schemas.microsoft.com/office/word/2010/wordprocessingInk" xmlns:wne="http://schemas.microsoft.com/office/word/2006/wordml" xmlns:wps="http://schemas.microsoft.com/office/word/2010/wordprocessingShape" mc:Ignorable="w14 w15 w16se w16cid w16 w16cex w16sdtdh w16sdtfl w16du wp14">
+<w:ftr xmlns:wpc="http://schemas.microsoft.com/office/word/2010/wordprocessingCanvas" xmlns:cx="http://schemas.microsoft.com/office/drawing/2014/chartex" xmlns:cx1="http://schemas.microsoft.com/office/drawing/2015/9/8/chartex" xmlns:cx2="http://schemas.microsoft.com/office/drawing/2015/10/21/chartex" xmlns:cx3="http://schemas.microsoft.com/office/drawing/2016/5/9/chartex" xmlns:cx4="http://schemas.microsoft.com/office/drawing/2016/5/10/chartex" xmlns:cx5="http://schemas.microsoft.com/office/drawing/2016/5/11/chartex" xmlns:cx6="http://schemas.microsoft.com/office/drawing/2016/5/12/chartex" xmlns:cx7="http://schemas.microsoft.com/office/drawing/2016/5/13/chartex" xmlns:cx8="http://schemas.microsoft.com/office/drawing/2016/5/14/chartex" xmlns:mc="http://schemas.openxmlformats.org/markup-compatibility/2006" xmlns:aink="http://schemas.microsoft.com/office/drawing/2016/ink" xmlns:am3d="http://schemas.microsoft.com/office/drawing/2017/model3d" xmlns:o="urn:schemas-microsoft-com:office:office" xmlns:oel="http://schemas.microsoft.com/office/2019/extlst" xmlns:r="http://schemas.openxmlformats.org/officeDocument/2006/relationships" xmlns:m="http://schemas.openxmlformats.org/officeDocument/2006/math" xmlns:v="urn:schemas-microsoft-com:vml" xmlns:wp14="http://schemas.microsoft.com/office/word/2010/wordprocessingDrawing" xmlns:wp="http://schemas.openxmlformats.org/drawingml/2006/wordprocessingDrawing" xmlns:w10="urn:schemas-microsoft-com:office:word" xmlns:w="http://schemas.openxmlformats.org/wordprocessingml/2006/main" xmlns:w14="http://schemas.microsoft.com/office/word/2010/wordml" xmlns:w15="http://schemas.microsoft.com/office/word/2012/wordml" xmlns:w16cex="http://schemas.microsoft.com/office/word/2018/wordml/cex" xmlns:w16cid="http://schemas.microsoft.com/office/word/2016/wordml/cid" xmlns:w16="http://schemas.microsoft.com/office/word/2018/wordml" xmlns:w16sdtdh="http://schemas.microsoft.com/office/word/2020/wordml/sdtdatahash" xmlns:w16se="http://schemas.microsoft.com/office/word/2015/wordml/symex" xmlns:wpg="http://schemas.microsoft.com/office/word/2010/wordprocessingGroup" xmlns:wpi="http://schemas.microsoft.com/office/word/2010/wordprocessingInk" xmlns:wne="http://schemas.microsoft.com/office/word/2006/wordml" xmlns:wps="http://schemas.microsoft.com/office/word/2010/wordprocessingShape" mc:Ignorable="w14 w15 w16se w16cid w16 w16cex w16sdtdh wp14">
   <w:p>
     <w:pPr>
-      <w:pStyle w:val="Footer"/>
+      <w:pStyle w:val="Piedepgina"/>
       <w:spacing w:before="240"/>
       <w:jc w:val="right"/>
     </w:pPr>
@@ -2229,7 +2266,7 @@
 </file>
 
 <file path=word/footnotes.xml><?xml version="1.0" encoding="utf-8"?>
-<w:footnotes xmlns:wpc="http://schemas.microsoft.com/office/word/2010/wordprocessingCanvas" xmlns:cx="http://schemas.microsoft.com/office/drawing/2014/chartex" xmlns:cx1="http://schemas.microsoft.com/office/drawing/2015/9/8/chartex" xmlns:cx2="http://schemas.microsoft.com/office/drawing/2015/10/21/chartex" xmlns:cx3="http://schemas.microsoft.com/office/drawing/2016/5/9/chartex" xmlns:cx4="http://schemas.microsoft.com/office/drawing/2016/5/10/chartex" xmlns:cx5="http://schemas.microsoft.com/office/drawing/2016/5/11/chartex" xmlns:cx6="http://schemas.microsoft.com/office/drawing/2016/5/12/chartex" xmlns:cx7="http://schemas.microsoft.com/office/drawing/2016/5/13/chartex" xmlns:cx8="http://schemas.microsoft.com/office/drawing/2016/5/14/chartex" xmlns:mc="http://schemas.openxmlformats.org/markup-compatibility/2006" xmlns:aink="http://schemas.microsoft.com/office/drawing/2016/ink" xmlns:am3d="http://schemas.microsoft.com/office/drawing/2017/model3d" xmlns:o="urn:schemas-microsoft-com:office:office" xmlns:oel="http://schemas.microsoft.com/office/2019/extlst" xmlns:r="http://schemas.openxmlformats.org/officeDocument/2006/relationships" xmlns:m="http://schemas.openxmlformats.org/officeDocument/2006/math" xmlns:v="urn:schemas-microsoft-com:vml" xmlns:wp14="http://schemas.microsoft.com/office/word/2010/wordprocessingDrawing" xmlns:wp="http://schemas.openxmlformats.org/drawingml/2006/wordprocessingDrawing" xmlns:w10="urn:schemas-microsoft-com:office:word" xmlns:w="http://schemas.openxmlformats.org/wordprocessingml/2006/main" xmlns:w14="http://schemas.microsoft.com/office/word/2010/wordml" xmlns:w15="http://schemas.microsoft.com/office/word/2012/wordml" xmlns:w16cex="http://schemas.microsoft.com/office/word/2018/wordml/cex" xmlns:w16cid="http://schemas.microsoft.com/office/word/2016/wordml/cid" xmlns:w16="http://schemas.microsoft.com/office/word/2018/wordml" xmlns:w16du="http://schemas.microsoft.com/office/word/2023/wordml/word16du" xmlns:w16sdtdh="http://schemas.microsoft.com/office/word/2020/wordml/sdtdatahash" xmlns:w16sdtfl="http://schemas.microsoft.com/office/word/2024/wordml/sdtformatlock" xmlns:w16se="http://schemas.microsoft.com/office/word/2015/wordml/symex" xmlns:wpg="http://schemas.microsoft.com/office/word/2010/wordprocessingGroup" xmlns:wpi="http://schemas.microsoft.com/office/word/2010/wordprocessingInk" xmlns:wne="http://schemas.microsoft.com/office/word/2006/wordml" xmlns:wps="http://schemas.microsoft.com/office/word/2010/wordprocessingShape" mc:Ignorable="w14 w15 w16se w16cid w16 w16cex w16sdtdh w16sdtfl w16du wp14">
+<w:footnotes xmlns:wpc="http://schemas.microsoft.com/office/word/2010/wordprocessingCanvas" xmlns:cx="http://schemas.microsoft.com/office/drawing/2014/chartex" xmlns:cx1="http://schemas.microsoft.com/office/drawing/2015/9/8/chartex" xmlns:cx2="http://schemas.microsoft.com/office/drawing/2015/10/21/chartex" xmlns:cx3="http://schemas.microsoft.com/office/drawing/2016/5/9/chartex" xmlns:cx4="http://schemas.microsoft.com/office/drawing/2016/5/10/chartex" xmlns:cx5="http://schemas.microsoft.com/office/drawing/2016/5/11/chartex" xmlns:cx6="http://schemas.microsoft.com/office/drawing/2016/5/12/chartex" xmlns:cx7="http://schemas.microsoft.com/office/drawing/2016/5/13/chartex" xmlns:cx8="http://schemas.microsoft.com/office/drawing/2016/5/14/chartex" xmlns:mc="http://schemas.openxmlformats.org/markup-compatibility/2006" xmlns:aink="http://schemas.microsoft.com/office/drawing/2016/ink" xmlns:am3d="http://schemas.microsoft.com/office/drawing/2017/model3d" xmlns:o="urn:schemas-microsoft-com:office:office" xmlns:oel="http://schemas.microsoft.com/office/2019/extlst" xmlns:r="http://schemas.openxmlformats.org/officeDocument/2006/relationships" xmlns:m="http://schemas.openxmlformats.org/officeDocument/2006/math" xmlns:v="urn:schemas-microsoft-com:vml" xmlns:wp14="http://schemas.microsoft.com/office/word/2010/wordprocessingDrawing" xmlns:wp="http://schemas.openxmlformats.org/drawingml/2006/wordprocessingDrawing" xmlns:w10="urn:schemas-microsoft-com:office:word" xmlns:w="http://schemas.openxmlformats.org/wordprocessingml/2006/main" xmlns:w14="http://schemas.microsoft.com/office/word/2010/wordml" xmlns:w15="http://schemas.microsoft.com/office/word/2012/wordml" xmlns:w16cex="http://schemas.microsoft.com/office/word/2018/wordml/cex" xmlns:w16cid="http://schemas.microsoft.com/office/word/2016/wordml/cid" xmlns:w16="http://schemas.microsoft.com/office/word/2018/wordml" xmlns:w16sdtdh="http://schemas.microsoft.com/office/word/2020/wordml/sdtdatahash" xmlns:w16se="http://schemas.microsoft.com/office/word/2015/wordml/symex" xmlns:wpg="http://schemas.microsoft.com/office/word/2010/wordprocessingGroup" xmlns:wpi="http://schemas.microsoft.com/office/word/2010/wordprocessingInk" xmlns:wne="http://schemas.microsoft.com/office/word/2006/wordml" xmlns:wps="http://schemas.microsoft.com/office/word/2010/wordprocessingShape" mc:Ignorable="w14 w15 w16se w16cid w16 w16cex w16sdtdh wp14">
   <w:footnote w:type="separator" w:id="-1">
     <w:p>
       <w:pPr>
@@ -2254,10 +2291,10 @@
 </file>
 
 <file path=word/header1.xml><?xml version="1.0" encoding="utf-8"?>
-<w:hdr xmlns:wpc="http://schemas.microsoft.com/office/word/2010/wordprocessingCanvas" xmlns:cx="http://schemas.microsoft.com/office/drawing/2014/chartex" xmlns:cx1="http://schemas.microsoft.com/office/drawing/2015/9/8/chartex" xmlns:cx2="http://schemas.microsoft.com/office/drawing/2015/10/21/chartex" xmlns:cx3="http://schemas.microsoft.com/office/drawing/2016/5/9/chartex" xmlns:cx4="http://schemas.microsoft.com/office/drawing/2016/5/10/chartex" xmlns:cx5="http://schemas.microsoft.com/office/drawing/2016/5/11/chartex" xmlns:cx6="http://schemas.microsoft.com/office/drawing/2016/5/12/chartex" xmlns:cx7="http://schemas.microsoft.com/office/drawing/2016/5/13/chartex" xmlns:cx8="http://schemas.microsoft.com/office/drawing/2016/5/14/chartex" xmlns:mc="http://schemas.openxmlformats.org/markup-compatibility/2006" xmlns:aink="http://schemas.microsoft.com/office/drawing/2016/ink" xmlns:am3d="http://schemas.microsoft.com/office/drawing/2017/model3d" xmlns:o="urn:schemas-microsoft-com:office:office" xmlns:oel="http://schemas.microsoft.com/office/2019/extlst" xmlns:r="http://schemas.openxmlformats.org/officeDocument/2006/relationships" xmlns:m="http://schemas.openxmlformats.org/officeDocument/2006/math" xmlns:v="urn:schemas-microsoft-com:vml" xmlns:wp14="http://schemas.microsoft.com/office/word/2010/wordprocessingDrawing" xmlns:wp="http://schemas.openxmlformats.org/drawingml/2006/wordprocessingDrawing" xmlns:w10="urn:schemas-microsoft-com:office:word" xmlns:w="http://schemas.openxmlformats.org/wordprocessingml/2006/main" xmlns:w14="http://schemas.microsoft.com/office/word/2010/wordml" xmlns:w15="http://schemas.microsoft.com/office/word/2012/wordml" xmlns:w16cex="http://schemas.microsoft.com/office/word/2018/wordml/cex" xmlns:w16cid="http://schemas.microsoft.com/office/word/2016/wordml/cid" xmlns:w16="http://schemas.microsoft.com/office/word/2018/wordml" xmlns:w16du="http://schemas.microsoft.com/office/word/2023/wordml/word16du" xmlns:w16sdtdh="http://schemas.microsoft.com/office/word/2020/wordml/sdtdatahash" xmlns:w16sdtfl="http://schemas.microsoft.com/office/word/2024/wordml/sdtformatlock" xmlns:w16se="http://schemas.microsoft.com/office/word/2015/wordml/symex" xmlns:wpg="http://schemas.microsoft.com/office/word/2010/wordprocessingGroup" xmlns:wpi="http://schemas.microsoft.com/office/word/2010/wordprocessingInk" xmlns:wne="http://schemas.microsoft.com/office/word/2006/wordml" xmlns:wps="http://schemas.microsoft.com/office/word/2010/wordprocessingShape" mc:Ignorable="w14 w15 w16se w16cid w16 w16cex w16sdtdh w16sdtfl w16du wp14">
+<w:hdr xmlns:wpc="http://schemas.microsoft.com/office/word/2010/wordprocessingCanvas" xmlns:cx="http://schemas.microsoft.com/office/drawing/2014/chartex" xmlns:cx1="http://schemas.microsoft.com/office/drawing/2015/9/8/chartex" xmlns:cx2="http://schemas.microsoft.com/office/drawing/2015/10/21/chartex" xmlns:cx3="http://schemas.microsoft.com/office/drawing/2016/5/9/chartex" xmlns:cx4="http://schemas.microsoft.com/office/drawing/2016/5/10/chartex" xmlns:cx5="http://schemas.microsoft.com/office/drawing/2016/5/11/chartex" xmlns:cx6="http://schemas.microsoft.com/office/drawing/2016/5/12/chartex" xmlns:cx7="http://schemas.microsoft.com/office/drawing/2016/5/13/chartex" xmlns:cx8="http://schemas.microsoft.com/office/drawing/2016/5/14/chartex" xmlns:mc="http://schemas.openxmlformats.org/markup-compatibility/2006" xmlns:aink="http://schemas.microsoft.com/office/drawing/2016/ink" xmlns:am3d="http://schemas.microsoft.com/office/drawing/2017/model3d" xmlns:o="urn:schemas-microsoft-com:office:office" xmlns:oel="http://schemas.microsoft.com/office/2019/extlst" xmlns:r="http://schemas.openxmlformats.org/officeDocument/2006/relationships" xmlns:m="http://schemas.openxmlformats.org/officeDocument/2006/math" xmlns:v="urn:schemas-microsoft-com:vml" xmlns:wp14="http://schemas.microsoft.com/office/word/2010/wordprocessingDrawing" xmlns:wp="http://schemas.openxmlformats.org/drawingml/2006/wordprocessingDrawing" xmlns:w10="urn:schemas-microsoft-com:office:word" xmlns:w="http://schemas.openxmlformats.org/wordprocessingml/2006/main" xmlns:w14="http://schemas.microsoft.com/office/word/2010/wordml" xmlns:w15="http://schemas.microsoft.com/office/word/2012/wordml" xmlns:w16cex="http://schemas.microsoft.com/office/word/2018/wordml/cex" xmlns:w16cid="http://schemas.microsoft.com/office/word/2016/wordml/cid" xmlns:w16="http://schemas.microsoft.com/office/word/2018/wordml" xmlns:w16sdtdh="http://schemas.microsoft.com/office/word/2020/wordml/sdtdatahash" xmlns:w16se="http://schemas.microsoft.com/office/word/2015/wordml/symex" xmlns:wpg="http://schemas.microsoft.com/office/word/2010/wordprocessingGroup" xmlns:wpi="http://schemas.microsoft.com/office/word/2010/wordprocessingInk" xmlns:wne="http://schemas.microsoft.com/office/word/2006/wordml" xmlns:wps="http://schemas.microsoft.com/office/word/2010/wordprocessingShape" mc:Ignorable="w14 w15 w16se w16cid w16 w16cex w16sdtdh wp14">
   <w:p>
     <w:pPr>
-      <w:pStyle w:val="Header"/>
+      <w:pStyle w:val="Encabezado"/>
       <w:spacing w:after="240"/>
       <w:jc w:val="right"/>
     </w:pPr>
@@ -2320,7 +2357,7 @@
 </file>
 
 <file path=word/numbering.xml><?xml version="1.0" encoding="utf-8"?>
-<w:numbering xmlns:wpc="http://schemas.microsoft.com/office/word/2010/wordprocessingCanvas" xmlns:cx="http://schemas.microsoft.com/office/drawing/2014/chartex" xmlns:cx1="http://schemas.microsoft.com/office/drawing/2015/9/8/chartex" xmlns:cx2="http://schemas.microsoft.com/office/drawing/2015/10/21/chartex" xmlns:cx3="http://schemas.microsoft.com/office/drawing/2016/5/9/chartex" xmlns:cx4="http://schemas.microsoft.com/office/drawing/2016/5/10/chartex" xmlns:cx5="http://schemas.microsoft.com/office/drawing/2016/5/11/chartex" xmlns:cx6="http://schemas.microsoft.com/office/drawing/2016/5/12/chartex" xmlns:cx7="http://schemas.microsoft.com/office/drawing/2016/5/13/chartex" xmlns:cx8="http://schemas.microsoft.com/office/drawing/2016/5/14/chartex" xmlns:mc="http://schemas.openxmlformats.org/markup-compatibility/2006" xmlns:aink="http://schemas.microsoft.com/office/drawing/2016/ink" xmlns:am3d="http://schemas.microsoft.com/office/drawing/2017/model3d" xmlns:o="urn:schemas-microsoft-com:office:office" xmlns:oel="http://schemas.microsoft.com/office/2019/extlst" xmlns:r="http://schemas.openxmlformats.org/officeDocument/2006/relationships" xmlns:m="http://schemas.openxmlformats.org/officeDocument/2006/math" xmlns:v="urn:schemas-microsoft-com:vml" xmlns:wp14="http://schemas.microsoft.com/office/word/2010/wordprocessingDrawing" xmlns:wp="http://schemas.openxmlformats.org/drawingml/2006/wordprocessingDrawing" xmlns:w10="urn:schemas-microsoft-com:office:word" xmlns:w="http://schemas.openxmlformats.org/wordprocessingml/2006/main" xmlns:w14="http://schemas.microsoft.com/office/word/2010/wordml" xmlns:w15="http://schemas.microsoft.com/office/word/2012/wordml" xmlns:w16cex="http://schemas.microsoft.com/office/word/2018/wordml/cex" xmlns:w16cid="http://schemas.microsoft.com/office/word/2016/wordml/cid" xmlns:w16="http://schemas.microsoft.com/office/word/2018/wordml" xmlns:w16du="http://schemas.microsoft.com/office/word/2023/wordml/word16du" xmlns:w16sdtdh="http://schemas.microsoft.com/office/word/2020/wordml/sdtdatahash" xmlns:w16sdtfl="http://schemas.microsoft.com/office/word/2024/wordml/sdtformatlock" xmlns:w16se="http://schemas.microsoft.com/office/word/2015/wordml/symex" xmlns:wpg="http://schemas.microsoft.com/office/word/2010/wordprocessingGroup" xmlns:wpi="http://schemas.microsoft.com/office/word/2010/wordprocessingInk" xmlns:wne="http://schemas.microsoft.com/office/word/2006/wordml" xmlns:wps="http://schemas.microsoft.com/office/word/2010/wordprocessingShape" mc:Ignorable="w14 w15 w16se w16cid w16 w16cex w16sdtdh w16sdtfl w16du wp14">
+<w:numbering xmlns:wpc="http://schemas.microsoft.com/office/word/2010/wordprocessingCanvas" xmlns:cx="http://schemas.microsoft.com/office/drawing/2014/chartex" xmlns:cx1="http://schemas.microsoft.com/office/drawing/2015/9/8/chartex" xmlns:cx2="http://schemas.microsoft.com/office/drawing/2015/10/21/chartex" xmlns:cx3="http://schemas.microsoft.com/office/drawing/2016/5/9/chartex" xmlns:cx4="http://schemas.microsoft.com/office/drawing/2016/5/10/chartex" xmlns:cx5="http://schemas.microsoft.com/office/drawing/2016/5/11/chartex" xmlns:cx6="http://schemas.microsoft.com/office/drawing/2016/5/12/chartex" xmlns:cx7="http://schemas.microsoft.com/office/drawing/2016/5/13/chartex" xmlns:cx8="http://schemas.microsoft.com/office/drawing/2016/5/14/chartex" xmlns:mc="http://schemas.openxmlformats.org/markup-compatibility/2006" xmlns:aink="http://schemas.microsoft.com/office/drawing/2016/ink" xmlns:am3d="http://schemas.microsoft.com/office/drawing/2017/model3d" xmlns:o="urn:schemas-microsoft-com:office:office" xmlns:oel="http://schemas.microsoft.com/office/2019/extlst" xmlns:r="http://schemas.openxmlformats.org/officeDocument/2006/relationships" xmlns:m="http://schemas.openxmlformats.org/officeDocument/2006/math" xmlns:v="urn:schemas-microsoft-com:vml" xmlns:wp14="http://schemas.microsoft.com/office/word/2010/wordprocessingDrawing" xmlns:wp="http://schemas.openxmlformats.org/drawingml/2006/wordprocessingDrawing" xmlns:w10="urn:schemas-microsoft-com:office:word" xmlns:w="http://schemas.openxmlformats.org/wordprocessingml/2006/main" xmlns:w14="http://schemas.microsoft.com/office/word/2010/wordml" xmlns:w15="http://schemas.microsoft.com/office/word/2012/wordml" xmlns:w16cex="http://schemas.microsoft.com/office/word/2018/wordml/cex" xmlns:w16cid="http://schemas.microsoft.com/office/word/2016/wordml/cid" xmlns:w16="http://schemas.microsoft.com/office/word/2018/wordml" xmlns:w16sdtdh="http://schemas.microsoft.com/office/word/2020/wordml/sdtdatahash" xmlns:w16se="http://schemas.microsoft.com/office/word/2015/wordml/symex" xmlns:wpg="http://schemas.microsoft.com/office/word/2010/wordprocessingGroup" xmlns:wpi="http://schemas.microsoft.com/office/word/2010/wordprocessingInk" xmlns:wne="http://schemas.microsoft.com/office/word/2006/wordml" xmlns:wps="http://schemas.microsoft.com/office/word/2010/wordprocessingShape" mc:Ignorable="w14 w15 w16se w16cid w16 w16cex w16sdtdh wp14">
   <w:abstractNum w:abstractNumId="0" w15:restartNumberingAfterBreak="0">
     <w:nsid w:val="11424236"/>
     <w:multiLevelType w:val="multilevel"/>
@@ -3353,7 +3390,7 @@
     <w:lvl w:ilvl="0">
       <w:start w:val="1"/>
       <w:numFmt w:val="upperRoman"/>
-      <w:pStyle w:val="Heading1"/>
+      <w:pStyle w:val="Ttulo1"/>
       <w:suff w:val="nothing"/>
       <w:lvlText w:val="Artículo %1"/>
       <w:lvlJc w:val="left"/>
@@ -3386,7 +3423,7 @@
     <w:lvl w:ilvl="1">
       <w:start w:val="1"/>
       <w:numFmt w:val="decimalZero"/>
-      <w:pStyle w:val="Heading2"/>
+      <w:pStyle w:val="Ttulo2"/>
       <w:isLgl/>
       <w:lvlText w:val="Sección %1.%2"/>
       <w:lvlJc w:val="left"/>
@@ -3419,7 +3456,7 @@
     <w:lvl w:ilvl="2">
       <w:start w:val="1"/>
       <w:numFmt w:val="lowerLetter"/>
-      <w:pStyle w:val="Heading3"/>
+      <w:pStyle w:val="Ttulo3"/>
       <w:lvlText w:val="(%3)"/>
       <w:lvlJc w:val="left"/>
       <w:pPr>
@@ -3456,7 +3493,7 @@
     <w:lvl w:ilvl="3">
       <w:start w:val="1"/>
       <w:numFmt w:val="lowerRoman"/>
-      <w:pStyle w:val="Heading4"/>
+      <w:pStyle w:val="Ttulo4"/>
       <w:lvlText w:val="(%4)"/>
       <w:lvlJc w:val="left"/>
       <w:pPr>
@@ -3486,7 +3523,7 @@
     <w:lvl w:ilvl="4">
       <w:start w:val="1"/>
       <w:numFmt w:val="decimal"/>
-      <w:pStyle w:val="Heading5"/>
+      <w:pStyle w:val="Ttulo5"/>
       <w:lvlText w:val="(%5)"/>
       <w:lvlJc w:val="left"/>
       <w:pPr>
@@ -3516,7 +3553,7 @@
     <w:lvl w:ilvl="5">
       <w:start w:val="1"/>
       <w:numFmt w:val="upperLetter"/>
-      <w:pStyle w:val="Heading6"/>
+      <w:pStyle w:val="Ttulo6"/>
       <w:suff w:val="nothing"/>
       <w:lvlText w:val="Anexo %6"/>
       <w:lvlJc w:val="left"/>
@@ -4174,7 +4211,7 @@
 </file>
 
 <file path=word/people.xml><?xml version="1.0" encoding="utf-8"?>
-<w15:people xmlns:wpc="http://schemas.microsoft.com/office/word/2010/wordprocessingCanvas" xmlns:cx="http://schemas.microsoft.com/office/drawing/2014/chartex" xmlns:cx1="http://schemas.microsoft.com/office/drawing/2015/9/8/chartex" xmlns:cx2="http://schemas.microsoft.com/office/drawing/2015/10/21/chartex" xmlns:cx3="http://schemas.microsoft.com/office/drawing/2016/5/9/chartex" xmlns:cx4="http://schemas.microsoft.com/office/drawing/2016/5/10/chartex" xmlns:cx5="http://schemas.microsoft.com/office/drawing/2016/5/11/chartex" xmlns:cx6="http://schemas.microsoft.com/office/drawing/2016/5/12/chartex" xmlns:cx7="http://schemas.microsoft.com/office/drawing/2016/5/13/chartex" xmlns:cx8="http://schemas.microsoft.com/office/drawing/2016/5/14/chartex" xmlns:mc="http://schemas.openxmlformats.org/markup-compatibility/2006" xmlns:aink="http://schemas.microsoft.com/office/drawing/2016/ink" xmlns:am3d="http://schemas.microsoft.com/office/drawing/2017/model3d" xmlns:o="urn:schemas-microsoft-com:office:office" xmlns:oel="http://schemas.microsoft.com/office/2019/extlst" xmlns:r="http://schemas.openxmlformats.org/officeDocument/2006/relationships" xmlns:m="http://schemas.openxmlformats.org/officeDocument/2006/math" xmlns:v="urn:schemas-microsoft-com:vml" xmlns:wp14="http://schemas.microsoft.com/office/word/2010/wordprocessingDrawing" xmlns:wp="http://schemas.openxmlformats.org/drawingml/2006/wordprocessingDrawing" xmlns:w10="urn:schemas-microsoft-com:office:word" xmlns:w="http://schemas.openxmlformats.org/wordprocessingml/2006/main" xmlns:w14="http://schemas.microsoft.com/office/word/2010/wordml" xmlns:w15="http://schemas.microsoft.com/office/word/2012/wordml" xmlns:w16cex="http://schemas.microsoft.com/office/word/2018/wordml/cex" xmlns:w16cid="http://schemas.microsoft.com/office/word/2016/wordml/cid" xmlns:w16="http://schemas.microsoft.com/office/word/2018/wordml" xmlns:w16du="http://schemas.microsoft.com/office/word/2023/wordml/word16du" xmlns:w16sdtdh="http://schemas.microsoft.com/office/word/2020/wordml/sdtdatahash" xmlns:w16sdtfl="http://schemas.microsoft.com/office/word/2024/wordml/sdtformatlock" xmlns:w16se="http://schemas.microsoft.com/office/word/2015/wordml/symex" xmlns:wpg="http://schemas.microsoft.com/office/word/2010/wordprocessingGroup" xmlns:wpi="http://schemas.microsoft.com/office/word/2010/wordprocessingInk" xmlns:wne="http://schemas.microsoft.com/office/word/2006/wordml" xmlns:wps="http://schemas.microsoft.com/office/word/2010/wordprocessingShape" mc:Ignorable="w14 w15 w16se w16cid w16 w16cex w16sdtdh w16sdtfl w16du wp14">
+<w15:people xmlns:wpc="http://schemas.microsoft.com/office/word/2010/wordprocessingCanvas" xmlns:cx="http://schemas.microsoft.com/office/drawing/2014/chartex" xmlns:cx1="http://schemas.microsoft.com/office/drawing/2015/9/8/chartex" xmlns:cx2="http://schemas.microsoft.com/office/drawing/2015/10/21/chartex" xmlns:cx3="http://schemas.microsoft.com/office/drawing/2016/5/9/chartex" xmlns:cx4="http://schemas.microsoft.com/office/drawing/2016/5/10/chartex" xmlns:cx5="http://schemas.microsoft.com/office/drawing/2016/5/11/chartex" xmlns:cx6="http://schemas.microsoft.com/office/drawing/2016/5/12/chartex" xmlns:cx7="http://schemas.microsoft.com/office/drawing/2016/5/13/chartex" xmlns:cx8="http://schemas.microsoft.com/office/drawing/2016/5/14/chartex" xmlns:mc="http://schemas.openxmlformats.org/markup-compatibility/2006" xmlns:aink="http://schemas.microsoft.com/office/drawing/2016/ink" xmlns:am3d="http://schemas.microsoft.com/office/drawing/2017/model3d" xmlns:o="urn:schemas-microsoft-com:office:office" xmlns:oel="http://schemas.microsoft.com/office/2019/extlst" xmlns:r="http://schemas.openxmlformats.org/officeDocument/2006/relationships" xmlns:m="http://schemas.openxmlformats.org/officeDocument/2006/math" xmlns:v="urn:schemas-microsoft-com:vml" xmlns:wp14="http://schemas.microsoft.com/office/word/2010/wordprocessingDrawing" xmlns:wp="http://schemas.openxmlformats.org/drawingml/2006/wordprocessingDrawing" xmlns:w10="urn:schemas-microsoft-com:office:word" xmlns:w="http://schemas.openxmlformats.org/wordprocessingml/2006/main" xmlns:w14="http://schemas.microsoft.com/office/word/2010/wordml" xmlns:w15="http://schemas.microsoft.com/office/word/2012/wordml" xmlns:w16cex="http://schemas.microsoft.com/office/word/2018/wordml/cex" xmlns:w16cid="http://schemas.microsoft.com/office/word/2016/wordml/cid" xmlns:w16="http://schemas.microsoft.com/office/word/2018/wordml" xmlns:w16sdtdh="http://schemas.microsoft.com/office/word/2020/wordml/sdtdatahash" xmlns:w16se="http://schemas.microsoft.com/office/word/2015/wordml/symex" xmlns:wpg="http://schemas.microsoft.com/office/word/2010/wordprocessingGroup" xmlns:wpi="http://schemas.microsoft.com/office/word/2010/wordprocessingInk" xmlns:wne="http://schemas.microsoft.com/office/word/2006/wordml" xmlns:wps="http://schemas.microsoft.com/office/word/2010/wordprocessingShape" mc:Ignorable="w14 w15 w16se w16cid w16 w16cex w16sdtdh wp14">
   <w15:person w15:author="Sofia Tobon -FK">
     <w15:presenceInfo w15:providerId="None" w15:userId="Sofia Tobon -FK"/>
   </w15:person>
@@ -4182,7 +4219,7 @@
 </file>
 
 <file path=word/styles.xml><?xml version="1.0" encoding="utf-8"?>
-<w:styles xmlns:mc="http://schemas.openxmlformats.org/markup-compatibility/2006" xmlns:r="http://schemas.openxmlformats.org/officeDocument/2006/relationships" xmlns:w="http://schemas.openxmlformats.org/wordprocessingml/2006/main" xmlns:w14="http://schemas.microsoft.com/office/word/2010/wordml" xmlns:w15="http://schemas.microsoft.com/office/word/2012/wordml" xmlns:w16cex="http://schemas.microsoft.com/office/word/2018/wordml/cex" xmlns:w16cid="http://schemas.microsoft.com/office/word/2016/wordml/cid" xmlns:w16="http://schemas.microsoft.com/office/word/2018/wordml" xmlns:w16du="http://schemas.microsoft.com/office/word/2023/wordml/word16du" xmlns:w16sdtdh="http://schemas.microsoft.com/office/word/2020/wordml/sdtdatahash" xmlns:w16sdtfl="http://schemas.microsoft.com/office/word/2024/wordml/sdtformatlock" xmlns:w16se="http://schemas.microsoft.com/office/word/2015/wordml/symex" mc:Ignorable="w14 w15 w16se w16cid w16 w16cex w16sdtdh w16sdtfl w16du">
+<w:styles xmlns:mc="http://schemas.openxmlformats.org/markup-compatibility/2006" xmlns:r="http://schemas.openxmlformats.org/officeDocument/2006/relationships" xmlns:w="http://schemas.openxmlformats.org/wordprocessingml/2006/main" xmlns:w14="http://schemas.microsoft.com/office/word/2010/wordml" xmlns:w15="http://schemas.microsoft.com/office/word/2012/wordml" xmlns:w16cex="http://schemas.microsoft.com/office/word/2018/wordml/cex" xmlns:w16cid="http://schemas.microsoft.com/office/word/2016/wordml/cid" xmlns:w16="http://schemas.microsoft.com/office/word/2018/wordml" xmlns:w16sdtdh="http://schemas.microsoft.com/office/word/2020/wordml/sdtdatahash" xmlns:w16se="http://schemas.microsoft.com/office/word/2015/wordml/symex" mc:Ignorable="w14 w15 w16se w16cid w16 w16cex w16sdtdh">
   <w:docDefaults>
     <w:rPrDefault>
       <w:rPr>
@@ -4592,12 +4629,12 @@
       <w:lang w:val="es-CO" w:eastAsia="es-CO"/>
     </w:rPr>
   </w:style>
-  <w:style w:type="paragraph" w:styleId="Heading1">
+  <w:style w:type="paragraph" w:styleId="Ttulo1">
     <w:name w:val="heading 1"/>
     <w:aliases w:val="H1,H1-Heading 1,Header 1,Heading 0,Hoofdstukkop,Legal Line 1,Lev 1,MT1,Niveau 1,SECTION,Section,Section Heading,Titulo 1,Título 1 Car,h1,head 1,l1,level 1,level1,título 1,título 11,título 111,título 112,título 12,título 13,título 14,título 15"/>
     <w:basedOn w:val="Normal"/>
     <w:next w:val="Normal"/>
-    <w:link w:val="Heading1Char"/>
+    <w:link w:val="Ttulo1Car1"/>
     <w:uiPriority w:val="9"/>
     <w:qFormat/>
     <w:rsid w:val="00DB0FBF"/>
@@ -4615,12 +4652,12 @@
       <w:u w:val="single"/>
     </w:rPr>
   </w:style>
-  <w:style w:type="paragraph" w:styleId="Heading2">
+  <w:style w:type="paragraph" w:styleId="Ttulo2">
     <w:name w:val="heading 2"/>
     <w:aliases w:val="H2 Char,Subsección,Título 2 Car Car,Título 2 Car Car Car Car,Título 2 Car1,Título 2 Car1 Car Car,SECCIONES,BONUS-T2"/>
     <w:basedOn w:val="Normal"/>
     <w:next w:val="Normal"/>
-    <w:link w:val="Heading2Char"/>
+    <w:link w:val="Ttulo2Car"/>
     <w:uiPriority w:val="9"/>
     <w:unhideWhenUsed/>
     <w:qFormat/>
@@ -4638,12 +4675,12 @@
       <w:u w:val="single"/>
     </w:rPr>
   </w:style>
-  <w:style w:type="paragraph" w:styleId="Heading3">
+  <w:style w:type="paragraph" w:styleId="Ttulo3">
     <w:name w:val="heading 3"/>
     <w:aliases w:val="Style 46,BONUS-T3 Final,Edgar 3,1.1.1Título 3,Título 3-BCN,3 bullet,2,H3,1,1Título 3"/>
     <w:basedOn w:val="Normal"/>
     <w:next w:val="Normal"/>
-    <w:link w:val="Heading3Char"/>
+    <w:link w:val="Ttulo3Car"/>
     <w:unhideWhenUsed/>
     <w:qFormat/>
     <w:rsid w:val="000B498A"/>
@@ -4659,11 +4696,11 @@
       <w:szCs w:val="22"/>
     </w:rPr>
   </w:style>
-  <w:style w:type="paragraph" w:styleId="Heading4">
+  <w:style w:type="paragraph" w:styleId="Ttulo4">
     <w:name w:val="heading 4"/>
     <w:basedOn w:val="Normal"/>
     <w:next w:val="Normal"/>
-    <w:link w:val="Heading4Char"/>
+    <w:link w:val="Ttulo4Car"/>
     <w:unhideWhenUsed/>
     <w:qFormat/>
     <w:rsid w:val="000B498A"/>
@@ -4679,11 +4716,11 @@
       <w:iCs/>
     </w:rPr>
   </w:style>
-  <w:style w:type="paragraph" w:styleId="Heading5">
+  <w:style w:type="paragraph" w:styleId="Ttulo5">
     <w:name w:val="heading 5"/>
     <w:basedOn w:val="Normal"/>
     <w:next w:val="Normal"/>
-    <w:link w:val="Heading5Char"/>
+    <w:link w:val="Ttulo5Car"/>
     <w:unhideWhenUsed/>
     <w:qFormat/>
     <w:rsid w:val="000B498A"/>
@@ -4698,7 +4735,7 @@
       <w:rFonts w:eastAsiaTheme="majorEastAsia" w:cstheme="majorBidi"/>
     </w:rPr>
   </w:style>
-  <w:style w:type="paragraph" w:styleId="Heading6">
+  <w:style w:type="paragraph" w:styleId="Ttulo6">
     <w:name w:val="heading 6"/>
     <w:basedOn w:val="Normal"/>
     <w:next w:val="Normal"/>
@@ -4723,13 +4760,13 @@
       <w:szCs w:val="22"/>
     </w:rPr>
   </w:style>
-  <w:style w:type="character" w:default="1" w:styleId="DefaultParagraphFont">
+  <w:style w:type="character" w:default="1" w:styleId="Fuentedeprrafopredeter">
     <w:name w:val="Default Paragraph Font"/>
     <w:uiPriority w:val="1"/>
     <w:semiHidden/>
     <w:unhideWhenUsed/>
   </w:style>
-  <w:style w:type="table" w:default="1" w:styleId="TableNormal">
+  <w:style w:type="table" w:default="1" w:styleId="Tablanormal">
     <w:name w:val="Normal Table"/>
     <w:uiPriority w:val="99"/>
     <w:semiHidden/>
@@ -4744,7 +4781,7 @@
       </w:tblCellMar>
     </w:tblPr>
   </w:style>
-  <w:style w:type="numbering" w:default="1" w:styleId="NoList">
+  <w:style w:type="numbering" w:default="1" w:styleId="Sinlista">
     <w:name w:val="No List"/>
     <w:uiPriority w:val="99"/>
     <w:semiHidden/>
@@ -4761,7 +4798,7 @@
       </w:tblCellMar>
     </w:tblPr>
   </w:style>
-  <w:style w:type="paragraph" w:styleId="Title">
+  <w:style w:type="paragraph" w:styleId="Ttulo">
     <w:name w:val="Title"/>
     <w:basedOn w:val="Normal"/>
     <w:next w:val="Normal"/>
@@ -4777,7 +4814,7 @@
       <w:szCs w:val="52"/>
     </w:rPr>
   </w:style>
-  <w:style w:type="paragraph" w:styleId="Subtitle">
+  <w:style w:type="paragraph" w:styleId="Subttulo">
     <w:name w:val="Subtitle"/>
     <w:basedOn w:val="Normal"/>
     <w:next w:val="Normal"/>
@@ -4795,26 +4832,26 @@
       <w:szCs w:val="30"/>
     </w:rPr>
   </w:style>
-  <w:style w:type="paragraph" w:styleId="CommentText">
+  <w:style w:type="paragraph" w:styleId="Textocomentario">
     <w:name w:val="annotation text"/>
     <w:basedOn w:val="Normal"/>
-    <w:link w:val="CommentTextChar"/>
+    <w:link w:val="TextocomentarioCar"/>
     <w:uiPriority w:val="99"/>
     <w:unhideWhenUsed/>
   </w:style>
-  <w:style w:type="character" w:customStyle="1" w:styleId="CommentTextChar">
-    <w:name w:val="Comment Text Char"/>
-    <w:basedOn w:val="DefaultParagraphFont"/>
-    <w:link w:val="CommentText"/>
+  <w:style w:type="character" w:customStyle="1" w:styleId="TextocomentarioCar">
+    <w:name w:val="Texto comentario Car"/>
+    <w:basedOn w:val="Fuentedeprrafopredeter"/>
+    <w:link w:val="Textocomentario"/>
     <w:uiPriority w:val="99"/>
     <w:rPr>
       <w:sz w:val="20"/>
       <w:szCs w:val="20"/>
     </w:rPr>
   </w:style>
-  <w:style w:type="character" w:styleId="CommentReference">
+  <w:style w:type="character" w:styleId="Refdecomentario">
     <w:name w:val="annotation reference"/>
-    <w:basedOn w:val="DefaultParagraphFont"/>
+    <w:basedOn w:val="Fuentedeprrafopredeter"/>
     <w:uiPriority w:val="99"/>
     <w:semiHidden/>
     <w:unhideWhenUsed/>
@@ -4885,7 +4922,7 @@
   </w:style>
   <w:style w:type="character" w:customStyle="1" w:styleId="AmArticle3Char">
     <w:name w:val="Am_Article 3 Char"/>
-    <w:basedOn w:val="DefaultParagraphFont"/>
+    <w:basedOn w:val="Fuentedeprrafopredeter"/>
     <w:link w:val="AmArticle3"/>
     <w:rsid w:val="00662BF7"/>
     <w:rPr>
@@ -4897,7 +4934,7 @@
   </w:style>
   <w:style w:type="character" w:customStyle="1" w:styleId="AmArticle3Car">
     <w:name w:val="Am_Article 3 Car"/>
-    <w:basedOn w:val="DefaultParagraphFont"/>
+    <w:basedOn w:val="Fuentedeprrafopredeter"/>
     <w:rsid w:val="00662BF7"/>
     <w:rPr>
       <w:rFonts w:ascii="Open Sans" w:eastAsia="Times New Roman" w:hAnsi="Open Sans" w:cs="Times New Roman"/>
@@ -4927,7 +4964,7 @@
   </w:style>
   <w:style w:type="character" w:customStyle="1" w:styleId="AmArticle4Char">
     <w:name w:val="Am_Article 4 Char"/>
-    <w:basedOn w:val="DefaultParagraphFont"/>
+    <w:basedOn w:val="Fuentedeprrafopredeter"/>
     <w:link w:val="AmArticle4"/>
     <w:rsid w:val="00662BF7"/>
     <w:rPr>
@@ -4958,7 +4995,7 @@
   </w:style>
   <w:style w:type="character" w:customStyle="1" w:styleId="AmArticle5Char">
     <w:name w:val="Am_Article 5 Char"/>
-    <w:basedOn w:val="DefaultParagraphFont"/>
+    <w:basedOn w:val="Fuentedeprrafopredeter"/>
     <w:link w:val="AmArticle5"/>
     <w:rsid w:val="00662BF7"/>
     <w:rPr>
@@ -4987,9 +5024,9 @@
       <w:lang w:val="es-CL" w:eastAsia="zh-CN" w:bidi="he-IL"/>
     </w:rPr>
   </w:style>
-  <w:style w:type="table" w:styleId="TableGrid">
+  <w:style w:type="table" w:styleId="Tablaconcuadrcula">
     <w:name w:val="Table Grid"/>
-    <w:basedOn w:val="TableNormal"/>
+    <w:basedOn w:val="Tablanormal"/>
     <w:uiPriority w:val="39"/>
     <w:rsid w:val="00D96667"/>
     <w:pPr>
@@ -5012,9 +5049,9 @@
       </w:tblBorders>
     </w:tblPr>
   </w:style>
-  <w:style w:type="character" w:styleId="PlaceholderText">
+  <w:style w:type="character" w:styleId="Textodelmarcadordeposicin">
     <w:name w:val="Placeholder Text"/>
-    <w:basedOn w:val="DefaultParagraphFont"/>
+    <w:basedOn w:val="Fuentedeprrafopredeter"/>
     <w:uiPriority w:val="99"/>
     <w:semiHidden/>
     <w:rsid w:val="00D96667"/>
@@ -5022,11 +5059,11 @@
       <w:color w:val="666666"/>
     </w:rPr>
   </w:style>
-  <w:style w:type="paragraph" w:styleId="CommentSubject">
+  <w:style w:type="paragraph" w:styleId="Asuntodelcomentario">
     <w:name w:val="annotation subject"/>
-    <w:basedOn w:val="CommentText"/>
-    <w:next w:val="CommentText"/>
-    <w:link w:val="CommentSubjectChar"/>
+    <w:basedOn w:val="Textocomentario"/>
+    <w:next w:val="Textocomentario"/>
+    <w:link w:val="AsuntodelcomentarioCar"/>
     <w:uiPriority w:val="99"/>
     <w:semiHidden/>
     <w:unhideWhenUsed/>
@@ -5036,10 +5073,10 @@
       <w:bCs/>
     </w:rPr>
   </w:style>
-  <w:style w:type="character" w:customStyle="1" w:styleId="CommentSubjectChar">
-    <w:name w:val="Comment Subject Char"/>
-    <w:basedOn w:val="CommentTextChar"/>
-    <w:link w:val="CommentSubject"/>
+  <w:style w:type="character" w:customStyle="1" w:styleId="AsuntodelcomentarioCar">
+    <w:name w:val="Asunto del comentario Car"/>
+    <w:basedOn w:val="TextocomentarioCar"/>
+    <w:link w:val="Asuntodelcomentario"/>
     <w:uiPriority w:val="99"/>
     <w:semiHidden/>
     <w:rsid w:val="00DA058D"/>
@@ -5052,11 +5089,11 @@
       <w:lang w:val="es-MX" w:eastAsia="en-US"/>
     </w:rPr>
   </w:style>
-  <w:style w:type="paragraph" w:styleId="ListParagraph">
+  <w:style w:type="paragraph" w:styleId="Prrafodelista">
     <w:name w:val="List Paragraph"/>
     <w:aliases w:val="Título1,Colorful List - Accent 11,Bolita,Párrafo antic,BOLADEF,Párrafo de lista2,Párrafo de lista3,Párrafo de lista21,BOLA,1. Anexo,Colorful List Accent 1,EY EPM - Lista,Estilo 3,Guión,HOJA,Lista vistosa - Énfasis 11,NORMAL,Titulo 8"/>
     <w:basedOn w:val="Normal"/>
-    <w:link w:val="ListParagraphChar"/>
+    <w:link w:val="PrrafodelistaCar"/>
     <w:uiPriority w:val="34"/>
     <w:qFormat/>
     <w:rsid w:val="0093169A"/>
@@ -5067,7 +5104,7 @@
   </w:style>
   <w:style w:type="paragraph" w:customStyle="1" w:styleId="DeclaracionesI">
     <w:name w:val="Declaraciones I"/>
-    <w:basedOn w:val="ListParagraph"/>
+    <w:basedOn w:val="Prrafodelista"/>
     <w:link w:val="DeclaracionesICar"/>
     <w:qFormat/>
     <w:rsid w:val="006C789F"/>
@@ -5079,7 +5116,7 @@
   </w:style>
   <w:style w:type="character" w:customStyle="1" w:styleId="DeclaracionesICar">
     <w:name w:val="Declaraciones I Car"/>
-    <w:basedOn w:val="DefaultParagraphFont"/>
+    <w:basedOn w:val="Fuentedeprrafopredeter"/>
     <w:link w:val="DeclaracionesI"/>
     <w:rsid w:val="006C789F"/>
     <w:rPr>
@@ -5089,10 +5126,10 @@
       <w:lang w:val="es-ES" w:eastAsia="es-ES"/>
     </w:rPr>
   </w:style>
-  <w:style w:type="character" w:customStyle="1" w:styleId="ListParagraphChar">
-    <w:name w:val="List Paragraph Char"/>
-    <w:aliases w:val="Título1 Char,Colorful List - Accent 11 Char,Bolita Char,Párrafo antic Char,BOLADEF Char,Párrafo de lista2 Char,Párrafo de lista3 Char,Párrafo de lista21 Char,BOLA Char,1. Anexo Char,Colorful List Accent 1 Char,EY EPM - Lista Char"/>
-    <w:link w:val="ListParagraph"/>
+  <w:style w:type="character" w:customStyle="1" w:styleId="PrrafodelistaCar">
+    <w:name w:val="Párrafo de lista Car"/>
+    <w:aliases w:val="Título1 Car,Colorful List - Accent 11 Car,Bolita Car,Párrafo antic Car,BOLADEF Car,Párrafo de lista2 Car,Párrafo de lista3 Car,Párrafo de lista21 Car,BOLA Car,1. Anexo Car,Colorful List Accent 1 Car,EY EPM - Lista Car,Estilo 3 Car"/>
+    <w:link w:val="Prrafodelista"/>
     <w:uiPriority w:val="1"/>
     <w:qFormat/>
     <w:rsid w:val="0093169A"/>
@@ -5118,7 +5155,7 @@
   </w:style>
   <w:style w:type="character" w:customStyle="1" w:styleId="cf01">
     <w:name w:val="cf01"/>
-    <w:basedOn w:val="DefaultParagraphFont"/>
+    <w:basedOn w:val="Fuentedeprrafopredeter"/>
     <w:rsid w:val="00B745D7"/>
     <w:rPr>
       <w:rFonts w:ascii="Segoe UI" w:hAnsi="Segoe UI" w:cs="Segoe UI" w:hint="default"/>
@@ -5144,11 +5181,11 @@
       <w:lang w:val="es-ES"/>
     </w:rPr>
   </w:style>
-  <w:style w:type="character" w:customStyle="1" w:styleId="Heading1Char">
-    <w:name w:val="Heading 1 Char"/>
-    <w:aliases w:val="H1 Char,H1-Heading 1 Char,Header 1 Char,Heading 0 Char,Hoofdstukkop Char,Legal Line 1 Char,Lev 1 Char,MT1 Char,Niveau 1 Char,SECTION Char,Section Char,Section Heading Char,Titulo 1 Char,Título 1 Car Char,h1 Char,head 1 Char,l1 Char"/>
-    <w:basedOn w:val="DefaultParagraphFont"/>
-    <w:link w:val="Heading1"/>
+  <w:style w:type="character" w:customStyle="1" w:styleId="Ttulo1Car1">
+    <w:name w:val="Título 1 Car1"/>
+    <w:aliases w:val="H1 Car,H1-Heading 1 Car,Header 1 Car,Heading 0 Car,Hoofdstukkop Car,Legal Line 1 Car,Lev 1 Car,MT1 Car,Niveau 1 Car,SECTION Car,Section Car,Section Heading Car,Titulo 1 Car,Título 1 Car Car,h1 Car,head 1 Car,l1 Car,level 1 Car,level1 Car"/>
+    <w:basedOn w:val="Fuentedeprrafopredeter"/>
+    <w:link w:val="Ttulo1"/>
     <w:uiPriority w:val="9"/>
     <w:rsid w:val="00DB0FBF"/>
     <w:rPr>
@@ -5160,11 +5197,11 @@
       <w:lang w:val="es-CO" w:eastAsia="es-CO"/>
     </w:rPr>
   </w:style>
-  <w:style w:type="character" w:customStyle="1" w:styleId="Heading2Char">
-    <w:name w:val="Heading 2 Char"/>
-    <w:aliases w:val="H2 Char Char,Subsección Char,Título 2 Car Car Char,Título 2 Car Car Car Car Char,Título 2 Car1 Char,Título 2 Car1 Car Car Char,SECCIONES Char,BONUS-T2 Char"/>
-    <w:basedOn w:val="DefaultParagraphFont"/>
-    <w:link w:val="Heading2"/>
+  <w:style w:type="character" w:customStyle="1" w:styleId="Ttulo2Car">
+    <w:name w:val="Título 2 Car"/>
+    <w:aliases w:val="H2 Char Car,Subsección Car,Título 2 Car Car Car,Título 2 Car Car Car Car Car,Título 2 Car1 Car,Título 2 Car1 Car Car Car,SECCIONES Car,BONUS-T2 Car"/>
+    <w:basedOn w:val="Fuentedeprrafopredeter"/>
+    <w:link w:val="Ttulo2"/>
     <w:uiPriority w:val="9"/>
     <w:rsid w:val="000B498A"/>
     <w:rPr>
@@ -5175,11 +5212,11 @@
       <w:lang w:val="es-CO" w:eastAsia="es-CO"/>
     </w:rPr>
   </w:style>
-  <w:style w:type="character" w:customStyle="1" w:styleId="Heading3Char">
-    <w:name w:val="Heading 3 Char"/>
-    <w:aliases w:val="Style 46 Char,BONUS-T3 Final Char,Edgar 3 Char,1.1.1Título 3 Char,Título 3-BCN Char,3 bullet Char,2 Char,H3 Char,1 Char,1Título 3 Char"/>
-    <w:basedOn w:val="DefaultParagraphFont"/>
-    <w:link w:val="Heading3"/>
+  <w:style w:type="character" w:customStyle="1" w:styleId="Ttulo3Car">
+    <w:name w:val="Título 3 Car"/>
+    <w:aliases w:val="Style 46 Car,BONUS-T3 Final Car,Edgar 3 Car,1.1.1Título 3 Car,Título 3-BCN Car,3 bullet Car,2 Car,H3 Car,1 Car,1Título 3 Car"/>
+    <w:basedOn w:val="Fuentedeprrafopredeter"/>
+    <w:link w:val="Ttulo3"/>
     <w:rsid w:val="000B498A"/>
     <w:rPr>
       <w:rFonts w:ascii="Open Sans" w:eastAsiaTheme="majorEastAsia" w:hAnsi="Open Sans" w:cstheme="majorBidi"/>
@@ -5187,10 +5224,10 @@
       <w:lang w:val="es-CO" w:eastAsia="es-CO"/>
     </w:rPr>
   </w:style>
-  <w:style w:type="character" w:customStyle="1" w:styleId="Heading4Char">
-    <w:name w:val="Heading 4 Char"/>
-    <w:basedOn w:val="DefaultParagraphFont"/>
-    <w:link w:val="Heading4"/>
+  <w:style w:type="character" w:customStyle="1" w:styleId="Ttulo4Car">
+    <w:name w:val="Título 4 Car"/>
+    <w:basedOn w:val="Fuentedeprrafopredeter"/>
+    <w:link w:val="Ttulo4"/>
     <w:rsid w:val="000B498A"/>
     <w:rPr>
       <w:rFonts w:ascii="Open Sans" w:eastAsiaTheme="majorEastAsia" w:hAnsi="Open Sans" w:cstheme="majorBidi"/>
@@ -5200,10 +5237,10 @@
       <w:lang w:val="es-CO" w:eastAsia="es-CO"/>
     </w:rPr>
   </w:style>
-  <w:style w:type="character" w:customStyle="1" w:styleId="Heading5Char">
-    <w:name w:val="Heading 5 Char"/>
-    <w:basedOn w:val="DefaultParagraphFont"/>
-    <w:link w:val="Heading5"/>
+  <w:style w:type="character" w:customStyle="1" w:styleId="Ttulo5Car">
+    <w:name w:val="Título 5 Car"/>
+    <w:basedOn w:val="Fuentedeprrafopredeter"/>
+    <w:link w:val="Ttulo5"/>
     <w:rsid w:val="000B498A"/>
     <w:rPr>
       <w:rFonts w:ascii="Open Sans" w:eastAsiaTheme="majorEastAsia" w:hAnsi="Open Sans" w:cstheme="majorBidi"/>
@@ -5212,7 +5249,7 @@
       <w:lang w:val="es-CO" w:eastAsia="es-CO"/>
     </w:rPr>
   </w:style>
-  <w:style w:type="paragraph" w:styleId="Revision">
+  <w:style w:type="paragraph" w:styleId="Revisin">
     <w:name w:val="Revision"/>
     <w:hidden/>
     <w:uiPriority w:val="99"/>
@@ -5247,7 +5284,7 @@
   </w:style>
   <w:style w:type="table" w:customStyle="1" w:styleId="5">
     <w:name w:val="5"/>
-    <w:basedOn w:val="TableNormal"/>
+    <w:basedOn w:val="Tablanormal"/>
     <w:rsid w:val="00DB0FBF"/>
     <w:pPr>
       <w:widowControl w:val="0"/>
@@ -5272,10 +5309,10 @@
       </w:tblCellMar>
     </w:tblPr>
   </w:style>
-  <w:style w:type="paragraph" w:styleId="Header">
+  <w:style w:type="paragraph" w:styleId="Encabezado">
     <w:name w:val="header"/>
     <w:basedOn w:val="Normal"/>
-    <w:link w:val="HeaderChar"/>
+    <w:link w:val="EncabezadoCar"/>
     <w:uiPriority w:val="99"/>
     <w:unhideWhenUsed/>
     <w:rsid w:val="000C7422"/>
@@ -5287,10 +5324,10 @@
       <w:spacing w:after="0"/>
     </w:pPr>
   </w:style>
-  <w:style w:type="character" w:customStyle="1" w:styleId="HeaderChar">
-    <w:name w:val="Header Char"/>
-    <w:basedOn w:val="DefaultParagraphFont"/>
-    <w:link w:val="Header"/>
+  <w:style w:type="character" w:customStyle="1" w:styleId="EncabezadoCar">
+    <w:name w:val="Encabezado Car"/>
+    <w:basedOn w:val="Fuentedeprrafopredeter"/>
+    <w:link w:val="Encabezado"/>
     <w:uiPriority w:val="99"/>
     <w:rsid w:val="000C7422"/>
     <w:rPr>
@@ -5300,10 +5337,10 @@
       <w:lang w:val="es-CO" w:eastAsia="es-CO"/>
     </w:rPr>
   </w:style>
-  <w:style w:type="paragraph" w:styleId="Footer">
+  <w:style w:type="paragraph" w:styleId="Piedepgina">
     <w:name w:val="footer"/>
     <w:basedOn w:val="Normal"/>
-    <w:link w:val="FooterChar"/>
+    <w:link w:val="PiedepginaCar"/>
     <w:uiPriority w:val="99"/>
     <w:unhideWhenUsed/>
     <w:rsid w:val="000C7422"/>
@@ -5315,10 +5352,10 @@
       <w:spacing w:after="0"/>
     </w:pPr>
   </w:style>
-  <w:style w:type="character" w:customStyle="1" w:styleId="FooterChar">
-    <w:name w:val="Footer Char"/>
-    <w:basedOn w:val="DefaultParagraphFont"/>
-    <w:link w:val="Footer"/>
+  <w:style w:type="character" w:customStyle="1" w:styleId="PiedepginaCar">
+    <w:name w:val="Pie de página Car"/>
+    <w:basedOn w:val="Fuentedeprrafopredeter"/>
+    <w:link w:val="Piedepgina"/>
     <w:uiPriority w:val="99"/>
     <w:rsid w:val="000C7422"/>
     <w:rPr>

</xml_diff>